<commit_message>
docs: add code block to full example report
Co-Authored-By: Claude Opus 5.5 <noreply@anthropic.com>
</commit_message>
<xml_diff>
--- a/report.docx
+++ b/report.docx
@@ -1,6 +1,6 @@
 
 <file path=word/document.xml><?xml version="1.0" encoding="utf-8"?>
-<w:document xmlns:ns1="http://schemas.openxmlformats.org/markup-compatibility/2006" xmlns:ns2="http://schemas.openxmlformats.org/drawingml/2006/wordprocessingDrawing" xmlns:ns3="http://schemas.openxmlformats.org/drawingml/2006/main" xmlns:ns4="http://schemas.openxmlformats.org/drawingml/2006/picture" xmlns:ns5="http://schemas.openxmlformats.org/officeDocument/2006/relationships" xmlns:ns6="http://schemas.openxmlformats.org/officeDocument/2006/math" xmlns:w="http://schemas.openxmlformats.org/wordprocessingml/2006/main" ns1:Ignorable="w14 wp14 w15">
+<w:document xmlns:ns1="http://schemas.openxmlformats.org/markup-compatibility/2006" xmlns:ns2="http://schemas.openxmlformats.org/drawingml/2006/wordprocessingDrawing" xmlns:ns3="http://schemas.openxmlformats.org/drawingml/2006/main" xmlns:ns4="http://schemas.openxmlformats.org/drawingml/2006/picture" xmlns:r="http://schemas.openxmlformats.org/officeDocument/2006/relationships" xmlns:w="http://schemas.openxmlformats.org/wordprocessingml/2006/main" ns1:Ignorable="w14 wp14 w15">
   <w:body>
     <w:p>
       <w:pPr>
@@ -95,7 +95,7 @@
       </w:tblPr>
       <w:tblGrid>
         <w:gridCol w:w="4961"/>
-        <w:gridCol w:w="4961"/>
+        <w:gridCol w:w="4960"/>
       </w:tblGrid>
       <w:tr>
         <w:trPr>
@@ -144,7 +144,7 @@
         </w:tc>
         <w:tc>
           <w:tcPr>
-            <w:tcW w:w="4961" w:type="dxa"/>
+            <w:tcW w:w="4960" w:type="dxa"/>
             <w:tcBorders>
               <w:top w:val="nil"/>
               <w:left w:val="nil"/>
@@ -240,23 +240,23 @@
           </w:r>
           <w:r>
             <w:rPr>
-              <w:rStyle w:val="IndexLink"/>
               <w:webHidden/>
+              <w:rStyle w:val="Style6"/>
             </w:rPr>
             <w:instrText xml:space="preserve"> TOC \z \o "1-3" \u \h</w:instrText>
           </w:r>
           <w:r>
             <w:rPr>
-              <w:rStyle w:val="IndexLink"/>
               <w:webHidden/>
+              <w:rStyle w:val="Style6"/>
             </w:rPr>
             <w:fldChar w:fldCharType="separate"/>
           </w:r>
-          <w:hyperlink w:anchor="__RefHeading___Toc163_3125057023" w:tooltip="Вступ">
+          <w:hyperlink w:anchor="__RefHeading___Toc170_1676657736">
             <w:r>
               <w:rPr>
-                <w:rStyle w:val="IndexLink"/>
                 <w:webHidden/>
+                <w:rStyle w:val="Style6"/>
               </w:rPr>
               <w:t>Вступ</w:t>
               <w:tab/>
@@ -273,11 +273,11 @@
             </w:tabs>
             <w:rPr/>
           </w:pPr>
-          <w:hyperlink w:anchor="__RefHeading___Toc165_3125057023" w:tooltip="1 Основна частина">
+          <w:hyperlink w:anchor="__RefHeading___Toc172_1676657736">
             <w:r>
               <w:rPr>
-                <w:rStyle w:val="IndexLink"/>
                 <w:webHidden/>
+                <w:rStyle w:val="Style6"/>
               </w:rPr>
               <w:t>1 Основна частина</w:t>
               <w:tab/>
@@ -294,11 +294,11 @@
             </w:tabs>
             <w:rPr/>
           </w:pPr>
-          <w:hyperlink w:anchor="__RefHeading___Toc167_3125057023" w:tooltip="1.1 Опис результатів">
+          <w:hyperlink w:anchor="__RefHeading___Toc174_1676657736">
             <w:r>
               <w:rPr>
-                <w:rStyle w:val="IndexLink"/>
                 <w:webHidden/>
+                <w:rStyle w:val="Style6"/>
               </w:rPr>
               <w:t>1.1 Опис результатів</w:t>
               <w:tab/>
@@ -315,34 +315,13 @@
             </w:tabs>
             <w:rPr/>
           </w:pPr>
-          <w:hyperlink w:anchor="__RefHeading___Toc169_3125057023" w:tooltip="Висновки">
+          <w:hyperlink w:anchor="__RefHeading___Toc176_1676657736">
             <w:r>
               <w:rPr>
-                <w:rStyle w:val="IndexLink"/>
                 <w:webHidden/>
+                <w:rStyle w:val="Style6"/>
               </w:rPr>
               <w:t>Висновки</w:t>
-              <w:tab/>
-              <w:t>7</w:t>
-            </w:r>
-          </w:hyperlink>
-        </w:p>
-        <w:p>
-          <w:pPr>
-            <w:pStyle w:val="TOC1"/>
-            <w:tabs>
-              <w:tab w:val="clear" w:pos="9922"/>
-              <w:tab w:val="right" w:pos="9921" w:leader="dot"/>
-            </w:tabs>
-            <w:rPr/>
-          </w:pPr>
-          <w:hyperlink w:anchor="__RefHeading___Toc171_3125057023" w:tooltip="Перелік джерел посилання">
-            <w:r>
-              <w:rPr>
-                <w:rStyle w:val="IndexLink"/>
-                <w:webHidden/>
-              </w:rPr>
-              <w:t>Перелік джерел посилання</w:t>
               <w:tab/>
               <w:t>8</w:t>
             </w:r>
@@ -357,15 +336,36 @@
             </w:tabs>
             <w:rPr/>
           </w:pPr>
-          <w:hyperlink w:anchor="__RefHeading___Toc173_3125057023" w:tooltip="Додаток А">
+          <w:hyperlink w:anchor="__RefHeading___Toc178_1676657736">
             <w:r>
               <w:rPr>
-                <w:rStyle w:val="IndexLink"/>
                 <w:webHidden/>
+                <w:rStyle w:val="Style6"/>
+              </w:rPr>
+              <w:t>Перелік джерел посилання</w:t>
+              <w:tab/>
+              <w:t>9</w:t>
+            </w:r>
+          </w:hyperlink>
+        </w:p>
+        <w:p>
+          <w:pPr>
+            <w:pStyle w:val="TOC1"/>
+            <w:tabs>
+              <w:tab w:val="clear" w:pos="9922"/>
+              <w:tab w:val="right" w:pos="9921" w:leader="dot"/>
+            </w:tabs>
+            <w:rPr/>
+          </w:pPr>
+          <w:hyperlink w:anchor="__RefHeading___Toc180_1676657736">
+            <w:r>
+              <w:rPr>
+                <w:webHidden/>
+                <w:rStyle w:val="Style6"/>
               </w:rPr>
               <w:t>Додаток А</w:t>
               <w:tab/>
-              <w:t>9</w:t>
+              <w:t>10</w:t>
             </w:r>
           </w:hyperlink>
         </w:p>
@@ -378,20 +378,20 @@
             </w:tabs>
             <w:rPr/>
           </w:pPr>
-          <w:hyperlink w:anchor="__RefHeading___Toc175_3125057023" w:tooltip="Приклад матеріалу додатка">
+          <w:hyperlink w:anchor="__RefHeading___Toc182_1676657736">
             <w:r>
               <w:rPr>
-                <w:rStyle w:val="IndexLink"/>
                 <w:webHidden/>
+                <w:rStyle w:val="Style6"/>
               </w:rPr>
               <w:t>Приклад матеріалу додатка</w:t>
               <w:tab/>
-              <w:t>9</w:t>
+              <w:t>10</w:t>
             </w:r>
           </w:hyperlink>
           <w:r>
             <w:rPr>
-              <w:rStyle w:val="IndexLink"/>
+              <w:rStyle w:val="Style6"/>
             </w:rPr>
             <w:fldChar w:fldCharType="end"/>
           </w:r>
@@ -443,7 +443,7 @@
         <w:pStyle w:val="Heading1"/>
         <w:rPr/>
       </w:pPr>
-      <w:bookmarkStart w:id="0" w:name="__RefHeading___Toc163_3125057023"/>
+      <w:bookmarkStart w:id="0" w:name="__RefHeading___Toc170_1676657736"/>
       <w:bookmarkStart w:id="1" w:name="вступ"/>
       <w:bookmarkEnd w:id="0"/>
       <w:r>
@@ -456,11 +456,12 @@
         <w:pStyle w:val="FirstParagraph"/>
         <w:rPr/>
       </w:pPr>
+      <w:bookmarkStart w:id="2" w:name="вступ"/>
       <w:r>
         <w:rPr/>
         <w:t>У вступі наводять актуальність, мету, завдання, методи та межі роботи.</w:t>
       </w:r>
-      <w:bookmarkEnd w:id="1"/>
+      <w:bookmarkEnd w:id="2"/>
     </w:p>
     <w:p>
       <w:pPr>
@@ -468,9 +469,9 @@
         <w:spacing w:before="360" w:after="0"/>
         <w:rPr/>
       </w:pPr>
-      <w:bookmarkStart w:id="2" w:name="__RefHeading___Toc165_3125057023"/>
-      <w:bookmarkStart w:id="3" w:name="основна-частина"/>
-      <w:bookmarkEnd w:id="2"/>
+      <w:bookmarkStart w:id="3" w:name="__RefHeading___Toc172_1676657736"/>
+      <w:bookmarkStart w:id="4" w:name="основна-частина"/>
+      <w:bookmarkEnd w:id="3"/>
       <w:r>
         <w:rPr>
           <w:rStyle w:val="SectionNumber"/>
@@ -489,9 +490,9 @@
         <w:spacing w:before="0" w:after="360"/>
         <w:rPr/>
       </w:pPr>
-      <w:bookmarkStart w:id="4" w:name="__RefHeading___Toc167_3125057023"/>
-      <w:bookmarkStart w:id="5" w:name="опис-результатів"/>
-      <w:bookmarkEnd w:id="4"/>
+      <w:bookmarkStart w:id="5" w:name="__RefHeading___Toc174_1676657736"/>
+      <w:bookmarkStart w:id="6" w:name="опис-результатів"/>
+      <w:bookmarkEnd w:id="5"/>
       <w:r>
         <w:rPr>
           <w:rStyle w:val="SectionNumber"/>
@@ -531,8 +532,8 @@
           <w:ilvl w:val="0"/>
           <w:numId w:val="6"/>
         </w:numPr>
-        <w:rPr/>
-        <w:ind w:left="709" w:firstLine="709"/>
+        <w:ind w:hanging="425" w:left="1134"/>
+        <w:rPr/>
       </w:pPr>
       <w:r>
         <w:rPr/>
@@ -546,8 +547,8 @@
           <w:ilvl w:val="0"/>
           <w:numId w:val="1"/>
         </w:numPr>
-        <w:rPr/>
-        <w:ind w:left="709" w:firstLine="709"/>
+        <w:ind w:hanging="425" w:left="1134"/>
+        <w:rPr/>
       </w:pPr>
       <w:r>
         <w:rPr/>
@@ -557,7 +558,7 @@
     <w:p>
       <w:pPr>
         <w:pStyle w:val="Compact"/>
-        <w:ind w:firstLine="1418" w:left="1418"/>
+        <w:ind w:hanging="425" w:left="1843"/>
         <w:rPr/>
       </w:pPr>
       <w:r>
@@ -580,8 +581,8 @@
           <w:ilvl w:val="2"/>
           <w:numId w:val="7"/>
         </w:numPr>
-        <w:rPr/>
-        <w:ind w:left="2127" w:firstLine="2127"/>
+        <w:ind w:hanging="425" w:left="2552"/>
+        <w:rPr/>
       </w:pPr>
       <w:r>
         <w:rPr/>
@@ -593,10 +594,10 @@
         <w:pStyle w:val="Compact"/>
         <w:numPr>
           <w:ilvl w:val="2"/>
-          <w:numId w:val="1"/>
+          <w:numId w:val="8"/>
         </w:numPr>
-        <w:rPr/>
-        <w:ind w:left="2127" w:firstLine="2127"/>
+        <w:ind w:hanging="425" w:left="2552"/>
+        <w:rPr/>
       </w:pPr>
       <w:r>
         <w:rPr/>
@@ -608,10 +609,10 @@
         <w:pStyle w:val="Compact"/>
         <w:numPr>
           <w:ilvl w:val="2"/>
-          <w:numId w:val="1"/>
+          <w:numId w:val="9"/>
         </w:numPr>
-        <w:rPr/>
-        <w:ind w:left="2127" w:firstLine="2127"/>
+        <w:ind w:hanging="425" w:left="2552"/>
+        <w:rPr/>
       </w:pPr>
       <w:r>
         <w:rPr/>
@@ -623,10 +624,10 @@
         <w:pStyle w:val="Compact"/>
         <w:numPr>
           <w:ilvl w:val="2"/>
-          <w:numId w:val="1"/>
+          <w:numId w:val="10"/>
         </w:numPr>
-        <w:rPr/>
-        <w:ind w:left="2127" w:firstLine="2127"/>
+        <w:ind w:hanging="425" w:left="2552"/>
+        <w:rPr/>
       </w:pPr>
       <w:r>
         <w:rPr/>
@@ -636,7 +637,7 @@
     <w:p>
       <w:pPr>
         <w:pStyle w:val="Compact"/>
-        <w:ind w:firstLine="1418" w:left="1418"/>
+        <w:ind w:hanging="425" w:left="1843"/>
         <w:rPr/>
       </w:pPr>
       <w:r>
@@ -655,7 +656,7 @@
     <w:p>
       <w:pPr>
         <w:pStyle w:val="Compact"/>
-        <w:ind w:firstLine="1418" w:left="1418"/>
+        <w:ind w:hanging="425" w:left="1843"/>
         <w:rPr/>
       </w:pPr>
       <w:r>
@@ -678,8 +679,8 @@
           <w:ilvl w:val="0"/>
           <w:numId w:val="1"/>
         </w:numPr>
-        <w:rPr/>
-        <w:ind w:left="709" w:firstLine="709"/>
+        <w:ind w:hanging="425" w:left="1134"/>
+        <w:rPr/>
       </w:pPr>
       <w:r>
         <w:rPr/>
@@ -703,8 +704,8 @@
           <w:ilvl w:val="0"/>
           <w:numId w:val="3"/>
         </w:numPr>
-        <w:rPr/>
-        <w:ind w:left="709" w:firstLine="709"/>
+        <w:ind w:hanging="425" w:left="1134"/>
+        <w:rPr/>
       </w:pPr>
       <w:r>
         <w:rPr/>
@@ -718,8 +719,8 @@
           <w:ilvl w:val="0"/>
           <w:numId w:val="3"/>
         </w:numPr>
-        <w:rPr/>
-        <w:ind w:left="709" w:firstLine="709"/>
+        <w:ind w:hanging="425" w:left="1134"/>
+        <w:rPr/>
       </w:pPr>
       <w:r>
         <w:rPr/>
@@ -733,8 +734,8 @@
           <w:ilvl w:val="0"/>
           <w:numId w:val="3"/>
         </w:numPr>
-        <w:rPr/>
-        <w:ind w:left="709" w:firstLine="709"/>
+        <w:ind w:hanging="425" w:left="1134"/>
+        <w:rPr/>
       </w:pPr>
       <w:r>
         <w:rPr/>
@@ -756,10 +757,10 @@
         <w:pStyle w:val="Compact"/>
         <w:numPr>
           <w:ilvl w:val="0"/>
-          <w:numId w:val="3"/>
+          <w:numId w:val="11"/>
         </w:numPr>
-        <w:rPr/>
-        <w:ind w:left="709" w:firstLine="709"/>
+        <w:ind w:hanging="425" w:left="1134"/>
+        <w:rPr/>
       </w:pPr>
       <w:r>
         <w:rPr/>
@@ -771,10 +772,10 @@
         <w:pStyle w:val="Compact"/>
         <w:numPr>
           <w:ilvl w:val="0"/>
-          <w:numId w:val="3"/>
+          <w:numId w:val="12"/>
         </w:numPr>
-        <w:rPr/>
-        <w:ind w:left="709" w:firstLine="709"/>
+        <w:ind w:hanging="425" w:left="1134"/>
+        <w:rPr/>
       </w:pPr>
       <w:r>
         <w:rPr/>
@@ -786,10 +787,10 @@
         <w:pStyle w:val="Compact"/>
         <w:numPr>
           <w:ilvl w:val="0"/>
-          <w:numId w:val="3"/>
+          <w:numId w:val="13"/>
         </w:numPr>
-        <w:rPr/>
-        <w:ind w:left="709" w:firstLine="709"/>
+        <w:ind w:hanging="425" w:left="1134"/>
+        <w:rPr/>
       </w:pPr>
       <w:r>
         <w:rPr/>
@@ -831,7 +832,7 @@
                     </ns4:cNvPicPr>
                   </ns4:nvPicPr>
                   <ns4:blipFill>
-                    <ns3:blip ns5:embed="rId2"/>
+                    <ns3:blip r:embed="rId2"/>
                     <ns3:stretch>
                       <ns3:fillRect/>
                     </ns3:stretch>
@@ -844,7 +845,6 @@
                     <ns3:prstGeom prst="rect">
                       <ns3:avLst/>
                     </ns3:prstGeom>
-                    <ns3:noFill/>
                   </ns4:spPr>
                 </ns4:pic>
               </ns3:graphicData>
@@ -909,7 +909,7 @@
         <w:tblStyle w:val="Table"/>
         <w:tblW w:w="7920" w:type="dxa"/>
         <w:jc w:val="left"/>
-        <w:tblInd w:w="0" w:type="dxa"/>
+        <w:tblInd w:w="118" w:type="dxa"/>
         <w:tblLayout w:type="fixed"/>
         <w:tblCellMar>
           <w:top w:w="0" w:type="dxa"/>
@@ -917,7 +917,7 @@
           <w:bottom w:w="0" w:type="dxa"/>
           <w:right w:w="108" w:type="dxa"/>
         </w:tblCellMar>
-        <w:tblLook w:noHBand="0" w:noVBand="0" w:firstColumn="0" w:lastRow="0" w:lastColumn="0" w:firstRow="1" w:val="0020"/>
+        <w:tblLook w:val="0020" w:noHBand="0" w:noVBand="0" w:firstColumn="0" w:lastRow="0" w:lastColumn="0" w:firstRow="1"/>
         <w:tblBorders>
           <w:top w:val="single" w:sz="8" w:space="0" w:color="000000"/>
           <w:left w:val="single" w:sz="8" w:space="0" w:color="000000"/>
@@ -929,7 +929,7 @@
       </w:tblPr>
       <w:tblGrid>
         <w:gridCol w:w="3960"/>
-        <w:gridCol w:w="3960"/>
+        <w:gridCol w:w="3959"/>
       </w:tblGrid>
       <w:tr>
         <w:trPr>
@@ -964,7 +964,7 @@
         </w:tc>
         <w:tc>
           <w:tcPr>
-            <w:tcW w:w="3960" w:type="dxa"/>
+            <w:tcW w:w="3959" w:type="dxa"/>
             <w:tcBorders>
               <w:top w:val="single" w:sz="8" w:space="0" w:color="000000"/>
               <w:left w:val="single" w:sz="8" w:space="0" w:color="000000"/>
@@ -1020,7 +1020,7 @@
         </w:tc>
         <w:tc>
           <w:tcPr>
-            <w:tcW w:w="3960" w:type="dxa"/>
+            <w:tcW w:w="3959" w:type="dxa"/>
             <w:tcBorders>
               <w:top w:val="single" w:sz="8" w:space="0" w:color="000000"/>
               <w:left w:val="single" w:sz="8" w:space="0" w:color="000000"/>
@@ -1074,50 +1074,6 @@
       <w:r>
         <w:rPr/>
         <w:tab/>
-      </w:r>
-      <w:r>
-        <w:rPr/>
-      </w:r>
-      <ns6:oMath>
-        <ns6:r>
-          <w:rPr>
-            <w:rFonts w:ascii="Cambria Math" w:hAnsi="Cambria Math"/>
-          </w:rPr>
-          <ns6:t xml:space="preserve">E</ns6:t>
-        </ns6:r>
-        <ns6:r>
-          <w:rPr>
-            <w:rFonts w:ascii="Cambria Math" w:hAnsi="Cambria Math"/>
-          </w:rPr>
-          <ns6:t xml:space="preserve">=</ns6:t>
-        </ns6:r>
-        <ns6:r>
-          <w:rPr>
-            <w:rFonts w:ascii="Cambria Math" w:hAnsi="Cambria Math"/>
-          </w:rPr>
-          <ns6:t xml:space="preserve">m</ns6:t>
-        </ns6:r>
-        <ns6:sSup>
-          <ns6:e>
-            <ns6:r>
-              <w:rPr>
-                <w:rFonts w:ascii="Cambria Math" w:hAnsi="Cambria Math"/>
-              </w:rPr>
-              <ns6:t xml:space="preserve">c</ns6:t>
-            </ns6:r>
-          </ns6:e>
-          <ns6:sup>
-            <ns6:r>
-              <w:rPr>
-                <w:rFonts w:ascii="Cambria Math" w:hAnsi="Cambria Math"/>
-              </w:rPr>
-              <ns6:t xml:space="preserve">2</ns6:t>
-            </ns6:r>
-          </ns6:sup>
-        </ns6:sSup>
-      </ns6:oMath>
-      <w:r>
-        <w:rPr/>
         <w:tab/>
         <w:t>(1.1)</w:t>
       </w:r>
@@ -1129,54 +1085,11 @@
       </w:pPr>
       <w:r>
         <w:rPr/>
-        <w:t xml:space="preserve">де </w:t>
-      </w:r>
-      <w:r>
-        <w:rPr/>
-      </w:r>
-      <ns6:oMath>
-        <ns6:r>
-          <w:rPr>
-            <w:rFonts w:ascii="Cambria Math" w:hAnsi="Cambria Math"/>
-          </w:rPr>
-          <ns6:t xml:space="preserve">E</ns6:t>
-        </ns6:r>
-      </ns6:oMath>
-      <w:r>
-        <w:rPr/>
-        <w:t xml:space="preserve"> — енергія;</w:t>
+        <w:t>де  – енергія;</w:t>
         <w:br/>
-      </w:r>
-      <w:r>
-        <w:rPr/>
-      </w:r>
-      <ns6:oMath>
-        <ns6:r>
-          <w:rPr>
-            <w:rFonts w:ascii="Cambria Math" w:hAnsi="Cambria Math"/>
-          </w:rPr>
-          <ns6:t xml:space="preserve">m</ns6:t>
-        </ns6:r>
-      </ns6:oMath>
-      <w:r>
-        <w:rPr/>
-        <w:t xml:space="preserve"> — маса;</w:t>
+        <w:t xml:space="preserve"> – маса;</w:t>
         <w:br/>
-      </w:r>
-      <w:r>
-        <w:rPr/>
-      </w:r>
-      <ns6:oMath>
-        <ns6:r>
-          <w:rPr>
-            <w:rFonts w:ascii="Cambria Math" w:hAnsi="Cambria Math"/>
-          </w:rPr>
-          <ns6:t xml:space="preserve">c</ns6:t>
-        </ns6:r>
-      </ns6:oMath>
-      <w:r>
-        <w:rPr/>
-        <w:t xml:space="preserve"> — швидкість світла.</w:t>
+        <w:t xml:space="preserve"> – швидкість світла.</w:t>
       </w:r>
     </w:p>
     <w:p>
@@ -1186,19 +1099,93 @@
       </w:pPr>
       <w:r>
         <w:rPr/>
+        <w:t>Програмний код наводять блоком коду із зазначенням мови:</w:t>
+      </w:r>
+    </w:p>
+    <w:p>
+      <w:pPr>
+        <w:pStyle w:val="SourceCode"/>
+        <w:rPr/>
+      </w:pPr>
+      <w:r>
+        <w:rPr>
+          <w:rStyle w:val="VerbatimChar"/>
+        </w:rPr>
+        <w:t>def fibonacci(n: int) -&gt; list[int]:</w:t>
+      </w:r>
+      <w:r>
+        <w:rPr/>
+        <w:br/>
+      </w:r>
+      <w:r>
+        <w:rPr>
+          <w:rStyle w:val="VerbatimChar"/>
+        </w:rPr>
+        <w:t xml:space="preserve">    """Повертає перші n чисел Фібоначчі."""</w:t>
+      </w:r>
+      <w:r>
+        <w:rPr/>
+        <w:br/>
+      </w:r>
+      <w:r>
+        <w:rPr>
+          <w:rStyle w:val="VerbatimChar"/>
+        </w:rPr>
+        <w:t xml:space="preserve">    result = [0, 1]</w:t>
+      </w:r>
+      <w:r>
+        <w:rPr/>
+        <w:br/>
+      </w:r>
+      <w:r>
+        <w:rPr>
+          <w:rStyle w:val="VerbatimChar"/>
+        </w:rPr>
+        <w:t xml:space="preserve">    for _ in range(2, n):</w:t>
+      </w:r>
+      <w:r>
+        <w:rPr/>
+        <w:br/>
+      </w:r>
+      <w:r>
+        <w:rPr>
+          <w:rStyle w:val="VerbatimChar"/>
+        </w:rPr>
+        <w:t xml:space="preserve">        result.append(result[-1] + result[-2])</w:t>
+      </w:r>
+      <w:r>
+        <w:rPr/>
+        <w:br/>
+      </w:r>
+      <w:r>
+        <w:rPr>
+          <w:rStyle w:val="VerbatimChar"/>
+        </w:rPr>
+        <w:t xml:space="preserve">    return result[:n]</w:t>
+      </w:r>
+    </w:p>
+    <w:p>
+      <w:pPr>
+        <w:pStyle w:val="FirstParagraph"/>
+        <w:rPr/>
+      </w:pPr>
+      <w:bookmarkStart w:id="7" w:name="основна-частина"/>
+      <w:bookmarkStart w:id="8" w:name="опис-результатів"/>
+      <w:r>
+        <w:rPr/>
         <w:t>Посилання на джерело має вигляд [1].</w:t>
       </w:r>
-      <w:bookmarkEnd w:id="3"/>
-      <w:bookmarkEnd w:id="5"/>
+      <w:bookmarkEnd w:id="7"/>
+      <w:bookmarkEnd w:id="8"/>
     </w:p>
     <w:p>
       <w:pPr>
         <w:pStyle w:val="Heading1"/>
         <w:rPr/>
       </w:pPr>
-      <w:bookmarkStart w:id="6" w:name="__RefHeading___Toc169_3125057023"/>
-      <w:bookmarkStart w:id="7" w:name="висновки"/>
-      <w:bookmarkEnd w:id="6"/>
+      <w:bookmarkStart w:id="9" w:name="__RefHeading___Toc176_1676657736"/>
+      <w:bookmarkStart w:id="10" w:name="висновки"/>
+      <w:bookmarkEnd w:id="9"/>
       <w:r>
         <w:rPr/>
         <w:t>ВИСНОВКИ</w:t>
@@ -1209,20 +1196,21 @@
         <w:pStyle w:val="FirstParagraph"/>
         <w:rPr/>
       </w:pPr>
+      <w:bookmarkStart w:id="11" w:name="висновки"/>
       <w:r>
         <w:rPr/>
         <w:t>У висновках стисло подають результати виконаної роботи.</w:t>
       </w:r>
-      <w:bookmarkEnd w:id="7"/>
+      <w:bookmarkEnd w:id="11"/>
     </w:p>
     <w:p>
       <w:pPr>
         <w:pStyle w:val="Heading1"/>
         <w:rPr/>
       </w:pPr>
-      <w:bookmarkStart w:id="8" w:name="__RefHeading___Toc171_3125057023"/>
-      <w:bookmarkStart w:id="9" w:name="перелік-джерел-посилання"/>
-      <w:bookmarkEnd w:id="8"/>
+      <w:bookmarkStart w:id="12" w:name="__RefHeading___Toc178_1676657736"/>
+      <w:bookmarkStart w:id="13" w:name="перелік-джерел-посилання"/>
+      <w:bookmarkEnd w:id="12"/>
       <w:r>
         <w:rPr/>
         <w:t>ПЕРЕЛІК ДЖЕРЕЛ ПОСИЛАННЯ</w:t>
@@ -1233,15 +1221,16 @@
         <w:pStyle w:val="Bibliography"/>
         <w:rPr/>
       </w:pPr>
-      <w:bookmarkStart w:id="10" w:name="refs"/>
-      <w:bookmarkStart w:id="11" w:name="ref-example"/>
+      <w:bookmarkStart w:id="14" w:name="перелік-джерел-посилання"/>
+      <w:bookmarkStart w:id="15" w:name="refs"/>
+      <w:bookmarkStart w:id="16" w:name="ref-example"/>
       <w:r>
         <w:rPr/>
         <w:t>1. Прізвище, І. Назва джерела. Київ, Назва установи, 2026.</w:t>
       </w:r>
-      <w:bookmarkEnd w:id="9"/>
-      <w:bookmarkEnd w:id="10"/>
-      <w:bookmarkEnd w:id="11"/>
+      <w:bookmarkEnd w:id="14"/>
+      <w:bookmarkEnd w:id="15"/>
+      <w:bookmarkEnd w:id="16"/>
     </w:p>
     <w:p>
       <w:pPr>
@@ -1249,9 +1238,9 @@
         <w:spacing w:before="360" w:after="0"/>
         <w:rPr/>
       </w:pPr>
-      <w:bookmarkStart w:id="12" w:name="__RefHeading___Toc173_3125057023"/>
-      <w:bookmarkStart w:id="13" w:name="додаток-а"/>
-      <w:bookmarkEnd w:id="12"/>
+      <w:bookmarkStart w:id="17" w:name="__RefHeading___Toc180_1676657736"/>
+      <w:bookmarkStart w:id="18" w:name="додаток-а"/>
+      <w:bookmarkEnd w:id="17"/>
       <w:r>
         <w:rPr/>
         <w:t>ДОДАТОК А</w:t>
@@ -1263,9 +1252,9 @@
         <w:spacing w:before="0" w:after="360"/>
         <w:rPr/>
       </w:pPr>
-      <w:bookmarkStart w:id="14" w:name="__RefHeading___Toc175_3125057023"/>
-      <w:bookmarkStart w:id="15" w:name="приклад-матеріалу-додатка"/>
-      <w:bookmarkEnd w:id="14"/>
+      <w:bookmarkStart w:id="19" w:name="__RefHeading___Toc182_1676657736"/>
+      <w:bookmarkStart w:id="20" w:name="приклад-матеріалу-додатка"/>
+      <w:bookmarkEnd w:id="19"/>
       <w:r>
         <w:rPr/>
         <w:t>Приклад матеріалу додатка</w:t>
@@ -1276,17 +1265,19 @@
         <w:pStyle w:val="FirstParagraph"/>
         <w:rPr/>
       </w:pPr>
+      <w:bookmarkStart w:id="21" w:name="додаток-а"/>
+      <w:bookmarkStart w:id="22" w:name="приклад-матеріалу-додатка"/>
       <w:r>
         <w:rPr/>
         <w:t>Кожен додаток починається з нової сторінки завдяки стилю заголовка першого рівня.</w:t>
       </w:r>
-      <w:bookmarkEnd w:id="13"/>
-      <w:bookmarkEnd w:id="15"/>
+      <w:bookmarkEnd w:id="21"/>
+      <w:bookmarkEnd w:id="22"/>
     </w:p>
     <w:sectPr>
-      <w:headerReference w:type="even" ns5:id="rId3"/>
-      <w:headerReference w:type="default" ns5:id="rId4"/>
-      <w:headerReference w:type="first" ns5:id="rId5"/>
+      <w:headerReference w:type="even" r:id="rId3"/>
+      <w:headerReference w:type="default" r:id="rId4"/>
+      <w:headerReference w:type="first" r:id="rId5"/>
       <w:type w:val="nextPage"/>
       <w:pgSz w:w="11906" w:h="16838"/>
       <w:pgMar w:left="1417" w:right="567" w:gutter="0" w:header="567" w:top="1134" w:footer="0" w:bottom="1134"/>
@@ -1301,7 +1292,7 @@
 </file>
 
 <file path=word/header1.xml><?xml version="1.0" encoding="utf-8"?>
-<w:hdr xmlns:o="urn:schemas-microsoft-com:office:office" xmlns:r="http://schemas.openxmlformats.org/officeDocument/2006/relationships" xmlns:v="urn:schemas-microsoft-com:vml" xmlns:w="http://schemas.openxmlformats.org/wordprocessingml/2006/main" xmlns:w10="urn:schemas-microsoft-com:office:word" xmlns:wp="http://schemas.openxmlformats.org/drawingml/2006/wordprocessingDrawing" xmlns:pic="http://schemas.openxmlformats.org/drawingml/2006/picture" xmlns:wps="http://schemas.microsoft.com/office/word/2010/wordprocessingShape" xmlns:wpg="http://schemas.microsoft.com/office/word/2010/wordprocessingGroup" xmlns:mc="http://schemas.openxmlformats.org/markup-compatibility/2006" xmlns:wp14="http://schemas.microsoft.com/office/word/2010/wordprocessingDrawing" xmlns:w14="http://schemas.microsoft.com/office/word/2010/wordml" xmlns:w15="http://schemas.microsoft.com/office/word/2012/wordml" mc:Ignorable="w14 wp14 w15">
+<w:hdr xmlns:o="urn:schemas-microsoft-com:office:office" xmlns:r="http://schemas.openxmlformats.org/officeDocument/2006/relationships" xmlns:v="urn:schemas-microsoft-com:vml" xmlns:w="http://schemas.openxmlformats.org/wordprocessingml/2006/main" xmlns:w10="urn:schemas-microsoft-com:office:word" xmlns:wp="http://schemas.openxmlformats.org/drawingml/2006/wordprocessingDrawing" xmlns:wps="http://schemas.microsoft.com/office/word/2010/wordprocessingShape" xmlns:wpg="http://schemas.microsoft.com/office/word/2010/wordprocessingGroup" xmlns:mc="http://schemas.openxmlformats.org/markup-compatibility/2006" xmlns:wp14="http://schemas.microsoft.com/office/word/2010/wordprocessingDrawing" xmlns:w14="http://schemas.microsoft.com/office/word/2010/wordml" xmlns:w15="http://schemas.microsoft.com/office/word/2012/wordml" mc:Ignorable="w14 wp14 w15">
   <w:p>
     <w:pPr>
       <w:pStyle w:val="Header"/>
@@ -1321,11 +1312,16 @@
       <w:pStyle w:val="Normal"/>
       <w:ind w:hanging="0"/>
       <w:jc w:val="right"/>
-      <w:rPr/>
+      <w:rPr>
+        <w:rFonts w:ascii="Times New Roman" w:hAnsi="Times New Roman" w:eastAsia="Times New Roman" w:cs="Times New Roman"/>
+        <w:color w:val="000000"/>
+        <w:sz w:val="20"/>
+        <w:szCs w:val="20"/>
+      </w:rPr>
     </w:pPr>
     <w:r>
       <w:rPr>
-        <w:rFonts w:eastAsia="Times New Roman" w:cs="Times New Roman" w:ascii="Times New Roman" w:hAnsi="Times New Roman"/>
+        <w:rFonts w:ascii="Times New Roman" w:hAnsi="Times New Roman" w:eastAsia="Times New Roman" w:cs="Times New Roman"/>
         <w:sz w:val="20"/>
         <w:szCs w:val="20"/>
       </w:rPr>
@@ -1333,7 +1329,7 @@
     </w:r>
     <w:r>
       <w:rPr>
-        <w:rFonts w:eastAsia="Times New Roman" w:cs="Times New Roman" w:ascii="Times New Roman" w:hAnsi="Times New Roman"/>
+        <w:rFonts w:ascii="Times New Roman" w:hAnsi="Times New Roman" w:eastAsia="Times New Roman" w:cs="Times New Roman"/>
         <w:sz w:val="20"/>
         <w:szCs w:val="20"/>
       </w:rPr>
@@ -1341,7 +1337,7 @@
     </w:r>
     <w:r>
       <w:rPr>
-        <w:rFonts w:eastAsia="Times New Roman" w:cs="Times New Roman" w:ascii="Times New Roman" w:hAnsi="Times New Roman"/>
+        <w:rFonts w:ascii="Times New Roman" w:hAnsi="Times New Roman" w:eastAsia="Times New Roman" w:cs="Times New Roman"/>
         <w:sz w:val="20"/>
         <w:szCs w:val="20"/>
       </w:rPr>
@@ -1349,15 +1345,15 @@
     </w:r>
     <w:r>
       <w:rPr>
-        <w:rFonts w:eastAsia="Times New Roman" w:cs="Times New Roman" w:ascii="Times New Roman" w:hAnsi="Times New Roman"/>
+        <w:rFonts w:ascii="Times New Roman" w:hAnsi="Times New Roman" w:eastAsia="Times New Roman" w:cs="Times New Roman"/>
         <w:sz w:val="20"/>
         <w:szCs w:val="20"/>
       </w:rPr>
-      <w:t>9</w:t>
+      <w:t>10</w:t>
     </w:r>
     <w:r>
       <w:rPr>
-        <w:rFonts w:eastAsia="Times New Roman" w:cs="Times New Roman" w:ascii="Times New Roman" w:hAnsi="Times New Roman"/>
+        <w:rFonts w:ascii="Times New Roman" w:hAnsi="Times New Roman" w:eastAsia="Times New Roman" w:cs="Times New Roman"/>
         <w:sz w:val="20"/>
         <w:szCs w:val="20"/>
       </w:rPr>
@@ -1368,7 +1364,7 @@
 </file>
 
 <file path=word/header3.xml><?xml version="1.0" encoding="utf-8"?>
-<w:hdr xmlns:o="urn:schemas-microsoft-com:office:office" xmlns:r="http://schemas.openxmlformats.org/officeDocument/2006/relationships" xmlns:v="urn:schemas-microsoft-com:vml" xmlns:w="http://schemas.openxmlformats.org/wordprocessingml/2006/main" xmlns:w10="urn:schemas-microsoft-com:office:word" xmlns:wp="http://schemas.openxmlformats.org/drawingml/2006/wordprocessingDrawing" xmlns:pic="http://schemas.openxmlformats.org/drawingml/2006/picture" xmlns:wps="http://schemas.microsoft.com/office/word/2010/wordprocessingShape" xmlns:wpg="http://schemas.microsoft.com/office/word/2010/wordprocessingGroup" xmlns:mc="http://schemas.openxmlformats.org/markup-compatibility/2006" xmlns:wp14="http://schemas.microsoft.com/office/word/2010/wordprocessingDrawing" xmlns:w14="http://schemas.microsoft.com/office/word/2010/wordml" xmlns:w15="http://schemas.microsoft.com/office/word/2012/wordml" mc:Ignorable="w14 wp14 w15">
+<w:hdr xmlns:o="urn:schemas-microsoft-com:office:office" xmlns:r="http://schemas.openxmlformats.org/officeDocument/2006/relationships" xmlns:v="urn:schemas-microsoft-com:vml" xmlns:w="http://schemas.openxmlformats.org/wordprocessingml/2006/main" xmlns:w10="urn:schemas-microsoft-com:office:word" xmlns:wp="http://schemas.openxmlformats.org/drawingml/2006/wordprocessingDrawing" xmlns:wps="http://schemas.microsoft.com/office/word/2010/wordprocessingShape" xmlns:wpg="http://schemas.microsoft.com/office/word/2010/wordprocessingGroup" xmlns:mc="http://schemas.openxmlformats.org/markup-compatibility/2006" xmlns:wp14="http://schemas.microsoft.com/office/word/2010/wordprocessingDrawing" xmlns:w14="http://schemas.microsoft.com/office/word/2010/wordml" xmlns:w15="http://schemas.microsoft.com/office/word/2012/wordml" mc:Ignorable="w14 wp14 w15">
   <w:p>
     <w:pPr>
       <w:pStyle w:val="Header"/>
@@ -1390,13 +1386,13 @@
       <w:lvlText w:val="%1."/>
       <w:lvlJc w:val="left"/>
       <w:pPr>
-        <w:ind w:left="709" w:firstLine="709"/>
-        <w:spacing w:before="0" w:after="0" w:line="360" w:lineRule="auto"/>
-      </w:pPr>
-      <w:rPr>
+        <w:ind w:left="1134" w:hanging="425"/>
+        <w:spacing w:before="0" w:after="0" w:line="360" w:lineRule="auto"/>
+      </w:pPr>
+      <w:rPr>
+        <w:sz w:val="28"/>
+        <w:szCs w:val="28"/>
         <w:rFonts w:ascii="Times New Roman" w:hAnsi="Times New Roman" w:eastAsia="Times New Roman" w:cs="Times New Roman"/>
-        <w:sz w:val="28"/>
-        <w:szCs w:val="28"/>
       </w:rPr>
     </w:lvl>
     <w:lvl w:ilvl="1">
@@ -1405,13 +1401,13 @@
       <w:lvlText w:val="%2)"/>
       <w:lvlJc w:val="left"/>
       <w:pPr>
-        <w:ind w:left="1418" w:firstLine="1418"/>
-        <w:spacing w:before="0" w:after="0" w:line="360" w:lineRule="auto"/>
-      </w:pPr>
-      <w:rPr>
+        <w:ind w:left="1843" w:hanging="425"/>
+        <w:spacing w:before="0" w:after="0" w:line="360" w:lineRule="auto"/>
+      </w:pPr>
+      <w:rPr>
+        <w:sz w:val="28"/>
+        <w:szCs w:val="28"/>
         <w:rFonts w:ascii="Times New Roman" w:hAnsi="Times New Roman" w:eastAsia="Times New Roman" w:cs="Times New Roman"/>
-        <w:sz w:val="28"/>
-        <w:szCs w:val="28"/>
       </w:rPr>
     </w:lvl>
     <w:lvl w:ilvl="2">
@@ -1420,13 +1416,13 @@
       <w:lvlText w:val="%3."/>
       <w:lvlJc w:val="left"/>
       <w:pPr>
-        <w:ind w:left="2127" w:firstLine="2127"/>
-        <w:spacing w:before="0" w:after="0" w:line="360" w:lineRule="auto"/>
-      </w:pPr>
-      <w:rPr>
+        <w:ind w:left="2552" w:hanging="425"/>
+        <w:spacing w:before="0" w:after="0" w:line="360" w:lineRule="auto"/>
+      </w:pPr>
+      <w:rPr>
+        <w:sz w:val="28"/>
+        <w:szCs w:val="28"/>
         <w:rFonts w:ascii="Times New Roman" w:hAnsi="Times New Roman" w:eastAsia="Times New Roman" w:cs="Times New Roman"/>
-        <w:sz w:val="28"/>
-        <w:szCs w:val="28"/>
       </w:rPr>
     </w:lvl>
     <w:lvl w:ilvl="3">
@@ -1435,13 +1431,13 @@
       <w:lvlText w:val="%4."/>
       <w:lvlJc w:val="left"/>
       <w:pPr>
-        <w:ind w:left="2836" w:firstLine="2836"/>
-        <w:spacing w:before="0" w:after="0" w:line="360" w:lineRule="auto"/>
-      </w:pPr>
-      <w:rPr>
+        <w:ind w:left="3261" w:hanging="425"/>
+        <w:spacing w:before="0" w:after="0" w:line="360" w:lineRule="auto"/>
+      </w:pPr>
+      <w:rPr>
+        <w:sz w:val="28"/>
+        <w:szCs w:val="28"/>
         <w:rFonts w:ascii="Times New Roman" w:hAnsi="Times New Roman" w:eastAsia="Times New Roman" w:cs="Times New Roman"/>
-        <w:sz w:val="28"/>
-        <w:szCs w:val="28"/>
       </w:rPr>
     </w:lvl>
     <w:lvl w:ilvl="4">
@@ -1450,13 +1446,13 @@
       <w:lvlText w:val="%5."/>
       <w:lvlJc w:val="left"/>
       <w:pPr>
-        <w:ind w:left="3545" w:firstLine="3545"/>
-        <w:spacing w:before="0" w:after="0" w:line="360" w:lineRule="auto"/>
-      </w:pPr>
-      <w:rPr>
+        <w:ind w:left="3970" w:hanging="425"/>
+        <w:spacing w:before="0" w:after="0" w:line="360" w:lineRule="auto"/>
+      </w:pPr>
+      <w:rPr>
+        <w:sz w:val="28"/>
+        <w:szCs w:val="28"/>
         <w:rFonts w:ascii="Times New Roman" w:hAnsi="Times New Roman" w:eastAsia="Times New Roman" w:cs="Times New Roman"/>
-        <w:sz w:val="28"/>
-        <w:szCs w:val="28"/>
       </w:rPr>
     </w:lvl>
     <w:lvl w:ilvl="5">
@@ -1465,13 +1461,13 @@
       <w:lvlText w:val="%6."/>
       <w:lvlJc w:val="left"/>
       <w:pPr>
-        <w:ind w:left="4254" w:firstLine="4254"/>
-        <w:spacing w:before="0" w:after="0" w:line="360" w:lineRule="auto"/>
-      </w:pPr>
-      <w:rPr>
+        <w:ind w:left="4679" w:hanging="425"/>
+        <w:spacing w:before="0" w:after="0" w:line="360" w:lineRule="auto"/>
+      </w:pPr>
+      <w:rPr>
+        <w:sz w:val="28"/>
+        <w:szCs w:val="28"/>
         <w:rFonts w:ascii="Times New Roman" w:hAnsi="Times New Roman" w:eastAsia="Times New Roman" w:cs="Times New Roman"/>
-        <w:sz w:val="28"/>
-        <w:szCs w:val="28"/>
       </w:rPr>
     </w:lvl>
     <w:lvl w:ilvl="6">
@@ -1480,13 +1476,13 @@
       <w:lvlText w:val="%7."/>
       <w:lvlJc w:val="left"/>
       <w:pPr>
-        <w:ind w:left="4963" w:firstLine="4963"/>
-        <w:spacing w:before="0" w:after="0" w:line="360" w:lineRule="auto"/>
-      </w:pPr>
-      <w:rPr>
+        <w:ind w:left="5388" w:hanging="425"/>
+        <w:spacing w:before="0" w:after="0" w:line="360" w:lineRule="auto"/>
+      </w:pPr>
+      <w:rPr>
+        <w:sz w:val="28"/>
+        <w:szCs w:val="28"/>
         <w:rFonts w:ascii="Times New Roman" w:hAnsi="Times New Roman" w:eastAsia="Times New Roman" w:cs="Times New Roman"/>
-        <w:sz w:val="28"/>
-        <w:szCs w:val="28"/>
       </w:rPr>
     </w:lvl>
     <w:lvl w:ilvl="7">
@@ -1495,13 +1491,13 @@
       <w:lvlText w:val="%8."/>
       <w:lvlJc w:val="left"/>
       <w:pPr>
-        <w:ind w:left="5672" w:firstLine="5672"/>
-        <w:spacing w:before="0" w:after="0" w:line="360" w:lineRule="auto"/>
-      </w:pPr>
-      <w:rPr>
+        <w:ind w:left="6097" w:hanging="425"/>
+        <w:spacing w:before="0" w:after="0" w:line="360" w:lineRule="auto"/>
+      </w:pPr>
+      <w:rPr>
+        <w:sz w:val="28"/>
+        <w:szCs w:val="28"/>
         <w:rFonts w:ascii="Times New Roman" w:hAnsi="Times New Roman" w:eastAsia="Times New Roman" w:cs="Times New Roman"/>
-        <w:sz w:val="28"/>
-        <w:szCs w:val="28"/>
       </w:rPr>
     </w:lvl>
     <w:lvl w:ilvl="8">
@@ -1510,13 +1506,13 @@
       <w:lvlText w:val="%9."/>
       <w:lvlJc w:val="left"/>
       <w:pPr>
-        <w:ind w:left="6381" w:firstLine="6381"/>
-        <w:spacing w:before="0" w:after="0" w:line="360" w:lineRule="auto"/>
-      </w:pPr>
-      <w:rPr>
+        <w:ind w:left="6806" w:hanging="425"/>
+        <w:spacing w:before="0" w:after="0" w:line="360" w:lineRule="auto"/>
+      </w:pPr>
+      <w:rPr>
+        <w:sz w:val="28"/>
+        <w:szCs w:val="28"/>
         <w:rFonts w:ascii="Times New Roman" w:hAnsi="Times New Roman" w:eastAsia="Times New Roman" w:cs="Times New Roman"/>
-        <w:sz w:val="28"/>
-        <w:szCs w:val="28"/>
       </w:rPr>
     </w:lvl>
   </w:abstractNum>
@@ -1527,13 +1523,13 @@
       <w:lvlText w:val="%1."/>
       <w:lvlJc w:val="left"/>
       <w:pPr>
-        <w:ind w:left="709" w:firstLine="709"/>
-        <w:spacing w:before="0" w:after="0" w:line="360" w:lineRule="auto"/>
-      </w:pPr>
-      <w:rPr>
+        <w:ind w:left="1134" w:hanging="425"/>
+        <w:spacing w:before="0" w:after="0" w:line="360" w:lineRule="auto"/>
+      </w:pPr>
+      <w:rPr>
+        <w:sz w:val="28"/>
+        <w:szCs w:val="28"/>
         <w:rFonts w:ascii="Times New Roman" w:hAnsi="Times New Roman" w:eastAsia="Times New Roman" w:cs="Times New Roman"/>
-        <w:sz w:val="28"/>
-        <w:szCs w:val="28"/>
       </w:rPr>
     </w:lvl>
     <w:lvl w:ilvl="1">
@@ -1542,13 +1538,13 @@
       <w:lvlText w:val="%2)"/>
       <w:lvlJc w:val="left"/>
       <w:pPr>
-        <w:ind w:left="1418" w:firstLine="1418"/>
-        <w:spacing w:before="0" w:after="0" w:line="360" w:lineRule="auto"/>
-      </w:pPr>
-      <w:rPr>
+        <w:ind w:left="1843" w:hanging="425"/>
+        <w:spacing w:before="0" w:after="0" w:line="360" w:lineRule="auto"/>
+      </w:pPr>
+      <w:rPr>
+        <w:sz w:val="28"/>
+        <w:szCs w:val="28"/>
         <w:rFonts w:ascii="Times New Roman" w:hAnsi="Times New Roman" w:eastAsia="Times New Roman" w:cs="Times New Roman"/>
-        <w:sz w:val="28"/>
-        <w:szCs w:val="28"/>
       </w:rPr>
     </w:lvl>
     <w:lvl w:ilvl="2">
@@ -1557,13 +1553,13 @@
       <w:lvlText w:val="%3."/>
       <w:lvlJc w:val="left"/>
       <w:pPr>
-        <w:ind w:left="2127" w:firstLine="2127"/>
-        <w:spacing w:before="0" w:after="0" w:line="360" w:lineRule="auto"/>
-      </w:pPr>
-      <w:rPr>
+        <w:ind w:left="2552" w:hanging="425"/>
+        <w:spacing w:before="0" w:after="0" w:line="360" w:lineRule="auto"/>
+      </w:pPr>
+      <w:rPr>
+        <w:sz w:val="28"/>
+        <w:szCs w:val="28"/>
         <w:rFonts w:ascii="Times New Roman" w:hAnsi="Times New Roman" w:eastAsia="Times New Roman" w:cs="Times New Roman"/>
-        <w:sz w:val="28"/>
-        <w:szCs w:val="28"/>
       </w:rPr>
     </w:lvl>
     <w:lvl w:ilvl="3">
@@ -1572,13 +1568,13 @@
       <w:lvlText w:val="%4."/>
       <w:lvlJc w:val="left"/>
       <w:pPr>
-        <w:ind w:left="2836" w:firstLine="2836"/>
-        <w:spacing w:before="0" w:after="0" w:line="360" w:lineRule="auto"/>
-      </w:pPr>
-      <w:rPr>
+        <w:ind w:left="3261" w:hanging="425"/>
+        <w:spacing w:before="0" w:after="0" w:line="360" w:lineRule="auto"/>
+      </w:pPr>
+      <w:rPr>
+        <w:sz w:val="28"/>
+        <w:szCs w:val="28"/>
         <w:rFonts w:ascii="Times New Roman" w:hAnsi="Times New Roman" w:eastAsia="Times New Roman" w:cs="Times New Roman"/>
-        <w:sz w:val="28"/>
-        <w:szCs w:val="28"/>
       </w:rPr>
     </w:lvl>
     <w:lvl w:ilvl="4">
@@ -1587,13 +1583,13 @@
       <w:lvlText w:val="%5."/>
       <w:lvlJc w:val="left"/>
       <w:pPr>
-        <w:ind w:left="3545" w:firstLine="3545"/>
-        <w:spacing w:before="0" w:after="0" w:line="360" w:lineRule="auto"/>
-      </w:pPr>
-      <w:rPr>
+        <w:ind w:left="3970" w:hanging="425"/>
+        <w:spacing w:before="0" w:after="0" w:line="360" w:lineRule="auto"/>
+      </w:pPr>
+      <w:rPr>
+        <w:sz w:val="28"/>
+        <w:szCs w:val="28"/>
         <w:rFonts w:ascii="Times New Roman" w:hAnsi="Times New Roman" w:eastAsia="Times New Roman" w:cs="Times New Roman"/>
-        <w:sz w:val="28"/>
-        <w:szCs w:val="28"/>
       </w:rPr>
     </w:lvl>
     <w:lvl w:ilvl="5">
@@ -1602,13 +1598,13 @@
       <w:lvlText w:val="%6."/>
       <w:lvlJc w:val="left"/>
       <w:pPr>
-        <w:ind w:left="4254" w:firstLine="4254"/>
-        <w:spacing w:before="0" w:after="0" w:line="360" w:lineRule="auto"/>
-      </w:pPr>
-      <w:rPr>
+        <w:ind w:left="4679" w:hanging="425"/>
+        <w:spacing w:before="0" w:after="0" w:line="360" w:lineRule="auto"/>
+      </w:pPr>
+      <w:rPr>
+        <w:sz w:val="28"/>
+        <w:szCs w:val="28"/>
         <w:rFonts w:ascii="Times New Roman" w:hAnsi="Times New Roman" w:eastAsia="Times New Roman" w:cs="Times New Roman"/>
-        <w:sz w:val="28"/>
-        <w:szCs w:val="28"/>
       </w:rPr>
     </w:lvl>
     <w:lvl w:ilvl="6">
@@ -1617,13 +1613,13 @@
       <w:lvlText w:val="%7."/>
       <w:lvlJc w:val="left"/>
       <w:pPr>
-        <w:ind w:left="4963" w:firstLine="4963"/>
-        <w:spacing w:before="0" w:after="0" w:line="360" w:lineRule="auto"/>
-      </w:pPr>
-      <w:rPr>
+        <w:ind w:left="5388" w:hanging="425"/>
+        <w:spacing w:before="0" w:after="0" w:line="360" w:lineRule="auto"/>
+      </w:pPr>
+      <w:rPr>
+        <w:sz w:val="28"/>
+        <w:szCs w:val="28"/>
         <w:rFonts w:ascii="Times New Roman" w:hAnsi="Times New Roman" w:eastAsia="Times New Roman" w:cs="Times New Roman"/>
-        <w:sz w:val="28"/>
-        <w:szCs w:val="28"/>
       </w:rPr>
     </w:lvl>
     <w:lvl w:ilvl="7">
@@ -1632,13 +1628,13 @@
       <w:lvlText w:val="%8."/>
       <w:lvlJc w:val="left"/>
       <w:pPr>
-        <w:ind w:left="5672" w:firstLine="5672"/>
-        <w:spacing w:before="0" w:after="0" w:line="360" w:lineRule="auto"/>
-      </w:pPr>
-      <w:rPr>
+        <w:ind w:left="6097" w:hanging="425"/>
+        <w:spacing w:before="0" w:after="0" w:line="360" w:lineRule="auto"/>
+      </w:pPr>
+      <w:rPr>
+        <w:sz w:val="28"/>
+        <w:szCs w:val="28"/>
         <w:rFonts w:ascii="Times New Roman" w:hAnsi="Times New Roman" w:eastAsia="Times New Roman" w:cs="Times New Roman"/>
-        <w:sz w:val="28"/>
-        <w:szCs w:val="28"/>
       </w:rPr>
     </w:lvl>
     <w:lvl w:ilvl="8">
@@ -1647,13 +1643,13 @@
       <w:lvlText w:val="%9."/>
       <w:lvlJc w:val="left"/>
       <w:pPr>
-        <w:ind w:left="6381" w:firstLine="6381"/>
-        <w:spacing w:before="0" w:after="0" w:line="360" w:lineRule="auto"/>
-      </w:pPr>
-      <w:rPr>
+        <w:ind w:left="6806" w:hanging="425"/>
+        <w:spacing w:before="0" w:after="0" w:line="360" w:lineRule="auto"/>
+      </w:pPr>
+      <w:rPr>
+        <w:sz w:val="28"/>
+        <w:szCs w:val="28"/>
         <w:rFonts w:ascii="Times New Roman" w:hAnsi="Times New Roman" w:eastAsia="Times New Roman" w:cs="Times New Roman"/>
-        <w:sz w:val="28"/>
-        <w:szCs w:val="28"/>
       </w:rPr>
     </w:lvl>
   </w:abstractNum>
@@ -1663,7 +1659,7 @@
       <w:lvlText w:val="–"/>
       <w:lvlJc w:val="left"/>
       <w:pPr>
-        <w:ind w:left="709" w:firstLine="709"/>
+        <w:ind w:left="1134" w:hanging="425"/>
         <w:spacing w:before="0" w:after="0" w:line="360" w:lineRule="auto"/>
       </w:pPr>
       <w:rPr>
@@ -1678,7 +1674,7 @@
       <w:lvlText w:val="–"/>
       <w:lvlJc w:val="left"/>
       <w:pPr>
-        <w:ind w:left="1418" w:firstLine="1418"/>
+        <w:ind w:left="1843" w:hanging="425"/>
         <w:spacing w:before="0" w:after="0" w:line="360" w:lineRule="auto"/>
       </w:pPr>
       <w:rPr>
@@ -1693,7 +1689,7 @@
       <w:lvlText w:val="–"/>
       <w:lvlJc w:val="left"/>
       <w:pPr>
-        <w:ind w:left="2127" w:firstLine="2127"/>
+        <w:ind w:left="2552" w:hanging="425"/>
         <w:spacing w:before="0" w:after="0" w:line="360" w:lineRule="auto"/>
       </w:pPr>
       <w:rPr>
@@ -1708,7 +1704,7 @@
       <w:lvlText w:val="–"/>
       <w:lvlJc w:val="left"/>
       <w:pPr>
-        <w:ind w:left="2836" w:firstLine="2836"/>
+        <w:ind w:left="3261" w:hanging="425"/>
         <w:spacing w:before="0" w:after="0" w:line="360" w:lineRule="auto"/>
       </w:pPr>
       <w:rPr>
@@ -1723,7 +1719,7 @@
       <w:lvlText w:val="–"/>
       <w:lvlJc w:val="left"/>
       <w:pPr>
-        <w:ind w:left="3545" w:firstLine="3545"/>
+        <w:ind w:left="3970" w:hanging="425"/>
         <w:spacing w:before="0" w:after="0" w:line="360" w:lineRule="auto"/>
       </w:pPr>
       <w:rPr>
@@ -1738,7 +1734,7 @@
       <w:lvlText w:val="–"/>
       <w:lvlJc w:val="left"/>
       <w:pPr>
-        <w:ind w:left="4254" w:firstLine="4254"/>
+        <w:ind w:left="4679" w:hanging="425"/>
         <w:spacing w:before="0" w:after="0" w:line="360" w:lineRule="auto"/>
       </w:pPr>
       <w:rPr>
@@ -1753,7 +1749,7 @@
       <w:lvlText w:val="–"/>
       <w:lvlJc w:val="left"/>
       <w:pPr>
-        <w:ind w:left="4963" w:firstLine="4963"/>
+        <w:ind w:left="5388" w:hanging="425"/>
         <w:spacing w:before="0" w:after="0" w:line="360" w:lineRule="auto"/>
       </w:pPr>
       <w:rPr>
@@ -1768,7 +1764,7 @@
       <w:lvlText w:val="–"/>
       <w:lvlJc w:val="left"/>
       <w:pPr>
-        <w:ind w:left="5672" w:firstLine="5672"/>
+        <w:ind w:left="6097" w:hanging="425"/>
         <w:spacing w:before="0" w:after="0" w:line="360" w:lineRule="auto"/>
       </w:pPr>
       <w:rPr>
@@ -1783,7 +1779,7 @@
       <w:lvlText w:val="–"/>
       <w:lvlJc w:val="left"/>
       <w:pPr>
-        <w:ind w:left="6381" w:firstLine="6381"/>
+        <w:ind w:left="6806" w:hanging="425"/>
         <w:spacing w:before="0" w:after="0" w:line="360" w:lineRule="auto"/>
       </w:pPr>
       <w:rPr>
@@ -1799,7 +1795,7 @@
       <w:lvlText w:val="–"/>
       <w:lvlJc w:val="left"/>
       <w:pPr>
-        <w:ind w:left="709" w:firstLine="709"/>
+        <w:ind w:left="1134" w:hanging="425"/>
         <w:spacing w:before="0" w:after="0" w:line="360" w:lineRule="auto"/>
       </w:pPr>
       <w:rPr>
@@ -1814,7 +1810,7 @@
       <w:lvlText w:val="–"/>
       <w:lvlJc w:val="left"/>
       <w:pPr>
-        <w:ind w:left="1418" w:firstLine="1418"/>
+        <w:ind w:left="1843" w:hanging="425"/>
         <w:spacing w:before="0" w:after="0" w:line="360" w:lineRule="auto"/>
       </w:pPr>
       <w:rPr>
@@ -1829,7 +1825,7 @@
       <w:lvlText w:val="–"/>
       <w:lvlJc w:val="left"/>
       <w:pPr>
-        <w:ind w:left="2127" w:firstLine="2127"/>
+        <w:ind w:left="2552" w:hanging="425"/>
         <w:spacing w:before="0" w:after="0" w:line="360" w:lineRule="auto"/>
       </w:pPr>
       <w:rPr>
@@ -1844,7 +1840,7 @@
       <w:lvlText w:val="–"/>
       <w:lvlJc w:val="left"/>
       <w:pPr>
-        <w:ind w:left="2836" w:firstLine="2836"/>
+        <w:ind w:left="3261" w:hanging="425"/>
         <w:spacing w:before="0" w:after="0" w:line="360" w:lineRule="auto"/>
       </w:pPr>
       <w:rPr>
@@ -1859,7 +1855,7 @@
       <w:lvlText w:val="–"/>
       <w:lvlJc w:val="left"/>
       <w:pPr>
-        <w:ind w:left="3545" w:firstLine="3545"/>
+        <w:ind w:left="3970" w:hanging="425"/>
         <w:spacing w:before="0" w:after="0" w:line="360" w:lineRule="auto"/>
       </w:pPr>
       <w:rPr>
@@ -1874,7 +1870,7 @@
       <w:lvlText w:val="–"/>
       <w:lvlJc w:val="left"/>
       <w:pPr>
-        <w:ind w:left="4254" w:firstLine="4254"/>
+        <w:ind w:left="4679" w:hanging="425"/>
         <w:spacing w:before="0" w:after="0" w:line="360" w:lineRule="auto"/>
       </w:pPr>
       <w:rPr>
@@ -1889,7 +1885,7 @@
       <w:lvlText w:val="–"/>
       <w:lvlJc w:val="left"/>
       <w:pPr>
-        <w:ind w:left="4963" w:firstLine="4963"/>
+        <w:ind w:left="5388" w:hanging="425"/>
         <w:spacing w:before="0" w:after="0" w:line="360" w:lineRule="auto"/>
       </w:pPr>
       <w:rPr>
@@ -1904,7 +1900,7 @@
       <w:lvlText w:val="–"/>
       <w:lvlJc w:val="left"/>
       <w:pPr>
-        <w:ind w:left="5672" w:firstLine="5672"/>
+        <w:ind w:left="6097" w:hanging="425"/>
         <w:spacing w:before="0" w:after="0" w:line="360" w:lineRule="auto"/>
       </w:pPr>
       <w:rPr>
@@ -1919,7 +1915,7 @@
       <w:lvlText w:val="–"/>
       <w:lvlJc w:val="left"/>
       <w:pPr>
-        <w:ind w:left="6381" w:firstLine="6381"/>
+        <w:ind w:left="6806" w:hanging="425"/>
         <w:spacing w:before="0" w:after="0" w:line="360" w:lineRule="auto"/>
       </w:pPr>
       <w:rPr>
@@ -1937,7 +1933,7 @@
       <w:lvlText w:val="%1."/>
       <w:lvlJc w:val="left"/>
       <w:pPr>
-        <w:ind w:left="709" w:firstLine="709"/>
+        <w:ind w:left="1134" w:hanging="425"/>
         <w:spacing w:before="0" w:after="0" w:line="360" w:lineRule="auto"/>
       </w:pPr>
       <w:rPr>
@@ -1953,7 +1949,7 @@
       <w:lvlText w:val="%2)"/>
       <w:lvlJc w:val="left"/>
       <w:pPr>
-        <w:ind w:left="1418" w:firstLine="1418"/>
+        <w:ind w:left="1843" w:hanging="425"/>
         <w:spacing w:before="0" w:after="0" w:line="360" w:lineRule="auto"/>
       </w:pPr>
       <w:rPr>
@@ -1969,7 +1965,7 @@
       <w:lvlText w:val="%3."/>
       <w:lvlJc w:val="left"/>
       <w:pPr>
-        <w:ind w:left="2127" w:firstLine="2127"/>
+        <w:ind w:left="2552" w:hanging="425"/>
         <w:spacing w:before="0" w:after="0" w:line="360" w:lineRule="auto"/>
       </w:pPr>
       <w:rPr>
@@ -1985,7 +1981,7 @@
       <w:lvlText w:val=""/>
       <w:lvlJc w:val="left"/>
       <w:pPr>
-        <w:ind w:left="2836" w:firstLine="2836"/>
+        <w:ind w:left="3261" w:hanging="425"/>
         <w:spacing w:before="0" w:after="0" w:line="360" w:lineRule="auto"/>
       </w:pPr>
       <w:rPr>
@@ -2001,7 +1997,7 @@
       <w:lvlText w:val=""/>
       <w:lvlJc w:val="left"/>
       <w:pPr>
-        <w:ind w:left="3545" w:firstLine="3545"/>
+        <w:ind w:left="3970" w:hanging="425"/>
         <w:spacing w:before="0" w:after="0" w:line="360" w:lineRule="auto"/>
       </w:pPr>
       <w:rPr>
@@ -2017,7 +2013,7 @@
       <w:lvlText w:val=""/>
       <w:lvlJc w:val="left"/>
       <w:pPr>
-        <w:ind w:left="4254" w:firstLine="4254"/>
+        <w:ind w:left="4679" w:hanging="425"/>
         <w:spacing w:before="0" w:after="0" w:line="360" w:lineRule="auto"/>
       </w:pPr>
       <w:rPr>
@@ -2033,7 +2029,7 @@
       <w:lvlText w:val=""/>
       <w:lvlJc w:val="left"/>
       <w:pPr>
-        <w:ind w:left="4963" w:firstLine="4963"/>
+        <w:ind w:left="5388" w:hanging="425"/>
         <w:spacing w:before="0" w:after="0" w:line="360" w:lineRule="auto"/>
       </w:pPr>
       <w:rPr>
@@ -2049,7 +2045,7 @@
       <w:lvlText w:val=""/>
       <w:lvlJc w:val="left"/>
       <w:pPr>
-        <w:ind w:left="5672" w:firstLine="5672"/>
+        <w:ind w:left="6097" w:hanging="425"/>
         <w:spacing w:before="0" w:after="0" w:line="360" w:lineRule="auto"/>
       </w:pPr>
       <w:rPr>
@@ -2065,7 +2061,7 @@
       <w:lvlText w:val=""/>
       <w:lvlJc w:val="left"/>
       <w:pPr>
-        <w:ind w:left="6381" w:firstLine="6381"/>
+        <w:ind w:left="6806" w:hanging="425"/>
         <w:spacing w:before="0" w:after="0" w:line="360" w:lineRule="auto"/>
       </w:pPr>
       <w:rPr>
@@ -2108,6 +2104,24 @@
       <w:startOverride w:val="1"/>
     </w:lvlOverride>
   </w:num>
+  <w:num w:numId="8">
+    <w:abstractNumId w:val="1"/>
+  </w:num>
+  <w:num w:numId="9">
+    <w:abstractNumId w:val="1"/>
+  </w:num>
+  <w:num w:numId="10">
+    <w:abstractNumId w:val="1"/>
+  </w:num>
+  <w:num w:numId="11">
+    <w:abstractNumId w:val="3"/>
+  </w:num>
+  <w:num w:numId="12">
+    <w:abstractNumId w:val="3"/>
+  </w:num>
+  <w:num w:numId="13">
+    <w:abstractNumId w:val="3"/>
+  </w:num>
 </w:numbering>
 </file>
 
@@ -2120,7 +2134,7 @@
         <w:color w:val="000000"/>
         <w:sz w:val="28"/>
         <w:szCs w:val="28"/>
-        <w:lang w:val="en-US" w:eastAsia="zh-CN" w:bidi="hi-IN"/>
+        <w:lang w:val="uk-UA" w:eastAsia="zh-CN" w:bidi="hi-IN"/>
       </w:rPr>
     </w:rPrDefault>
     <w:pPrDefault>
@@ -2146,17 +2160,15 @@
       <w:kern w:val="0"/>
       <w:sz w:val="28"/>
       <w:szCs w:val="28"/>
-      <w:lang w:val="en-US" w:eastAsia="zh-CN" w:bidi="hi-IN"/>
+      <w:lang w:val="uk-UA" w:eastAsia="zh-CN" w:bidi="hi-IN"/>
     </w:rPr>
   </w:style>
   <w:style w:type="paragraph" w:styleId="Heading1">
-    <w:name w:val="heading 1"/>
-    <w:basedOn w:val="Normal"/>
-    <w:next w:val="BodyText"/>
-    <w:link w:val="Heading1Char"/>
+    <w:name w:val="Heading 1"/>
+    <w:basedOn w:val="Normal"/>
+    <w:next w:val="BodyText"/>
     <w:uiPriority w:val="9"/>
     <w:qFormat/>
-    <w:rsid w:val="00a10fd9"/>
     <w:pPr>
       <w:keepNext w:val="true"/>
       <w:pageBreakBefore/>
@@ -2176,15 +2188,12 @@
     </w:rPr>
   </w:style>
   <w:style w:type="paragraph" w:styleId="Heading2">
-    <w:name w:val="heading 2"/>
-    <w:basedOn w:val="Normal"/>
-    <w:next w:val="BodyText"/>
-    <w:link w:val="Heading2Char"/>
+    <w:name w:val="Heading 2"/>
+    <w:basedOn w:val="Normal"/>
+    <w:next w:val="BodyText"/>
     <w:uiPriority w:val="9"/>
-    <w:semiHidden/>
     <w:unhideWhenUsed/>
     <w:qFormat/>
-    <w:rsid w:val="00a10fd9"/>
     <w:pPr>
       <w:keepNext w:val="true"/>
       <w:widowControl/>
@@ -2201,15 +2210,12 @@
     </w:rPr>
   </w:style>
   <w:style w:type="paragraph" w:styleId="Heading3">
-    <w:name w:val="heading 3"/>
-    <w:basedOn w:val="Normal"/>
-    <w:next w:val="BodyText"/>
-    <w:link w:val="Heading3Char"/>
+    <w:name w:val="Heading 3"/>
+    <w:basedOn w:val="Normal"/>
+    <w:next w:val="BodyText"/>
     <w:uiPriority w:val="9"/>
-    <w:semiHidden/>
     <w:unhideWhenUsed/>
     <w:qFormat/>
-    <w:rsid w:val="00a10fd9"/>
     <w:pPr>
       <w:keepNext w:val="true"/>
       <w:widowControl/>
@@ -2226,15 +2232,12 @@
     </w:rPr>
   </w:style>
   <w:style w:type="paragraph" w:styleId="Heading4">
-    <w:name w:val="heading 4"/>
-    <w:basedOn w:val="Normal"/>
-    <w:next w:val="BodyText"/>
-    <w:link w:val="Heading4Char"/>
+    <w:name w:val="Heading 4"/>
+    <w:basedOn w:val="Normal"/>
+    <w:next w:val="BodyText"/>
     <w:uiPriority w:val="9"/>
-    <w:semiHidden/>
     <w:unhideWhenUsed/>
     <w:qFormat/>
-    <w:rsid w:val="00a10fd9"/>
     <w:pPr>
       <w:keepNext w:val="true"/>
       <w:widowControl/>
@@ -2251,15 +2254,12 @@
     </w:rPr>
   </w:style>
   <w:style w:type="paragraph" w:styleId="Heading5">
-    <w:name w:val="heading 5"/>
-    <w:basedOn w:val="Normal"/>
-    <w:next w:val="BodyText"/>
-    <w:link w:val="Heading5Char"/>
+    <w:name w:val="Heading 5"/>
+    <w:basedOn w:val="Normal"/>
+    <w:next w:val="BodyText"/>
     <w:uiPriority w:val="9"/>
-    <w:semiHidden/>
     <w:unhideWhenUsed/>
     <w:qFormat/>
-    <w:rsid w:val="00a10fd9"/>
     <w:pPr>
       <w:keepNext w:val="true"/>
       <w:widowControl/>
@@ -2276,15 +2276,12 @@
     </w:rPr>
   </w:style>
   <w:style w:type="paragraph" w:styleId="Heading6">
-    <w:name w:val="heading 6"/>
-    <w:basedOn w:val="Normal"/>
-    <w:next w:val="BodyText"/>
-    <w:link w:val="Heading6Char"/>
+    <w:name w:val="Heading 6"/>
+    <w:basedOn w:val="Normal"/>
+    <w:next w:val="BodyText"/>
     <w:uiPriority w:val="9"/>
-    <w:semiHidden/>
     <w:unhideWhenUsed/>
     <w:qFormat/>
-    <w:rsid w:val="00a10fd9"/>
     <w:pPr>
       <w:keepNext w:val="true"/>
       <w:widowControl/>
@@ -2301,15 +2298,12 @@
     </w:rPr>
   </w:style>
   <w:style w:type="paragraph" w:styleId="Heading7">
-    <w:name w:val="heading 7"/>
-    <w:basedOn w:val="Normal"/>
-    <w:next w:val="BodyText"/>
-    <w:link w:val="Heading7Char"/>
+    <w:name w:val="Heading 7"/>
+    <w:basedOn w:val="Normal"/>
+    <w:next w:val="BodyText"/>
     <w:uiPriority w:val="9"/>
-    <w:semiHidden/>
     <w:unhideWhenUsed/>
     <w:qFormat/>
-    <w:rsid w:val="00a10fd9"/>
     <w:pPr>
       <w:keepNext w:val="true"/>
       <w:widowControl/>
@@ -2326,15 +2320,12 @@
     </w:rPr>
   </w:style>
   <w:style w:type="paragraph" w:styleId="Heading8">
-    <w:name w:val="heading 8"/>
-    <w:basedOn w:val="Normal"/>
-    <w:next w:val="BodyText"/>
-    <w:link w:val="Heading8Char"/>
+    <w:name w:val="Heading 8"/>
+    <w:basedOn w:val="Normal"/>
+    <w:next w:val="BodyText"/>
     <w:uiPriority w:val="9"/>
-    <w:semiHidden/>
     <w:unhideWhenUsed/>
     <w:qFormat/>
-    <w:rsid w:val="00a10fd9"/>
     <w:pPr>
       <w:keepNext w:val="true"/>
       <w:widowControl/>
@@ -2351,15 +2342,12 @@
     </w:rPr>
   </w:style>
   <w:style w:type="paragraph" w:styleId="Heading9">
-    <w:name w:val="heading 9"/>
-    <w:basedOn w:val="Normal"/>
-    <w:next w:val="BodyText"/>
-    <w:link w:val="Heading9Char"/>
+    <w:name w:val="Heading 9"/>
+    <w:basedOn w:val="Normal"/>
+    <w:next w:val="BodyText"/>
     <w:uiPriority w:val="9"/>
-    <w:semiHidden/>
     <w:unhideWhenUsed/>
     <w:qFormat/>
-    <w:rsid w:val="00a10fd9"/>
     <w:pPr>
       <w:keepNext w:val="true"/>
       <w:widowControl/>
@@ -2375,165 +2363,23 @@
       <w:szCs w:val="28"/>
     </w:rPr>
   </w:style>
-  <w:style w:type="character" w:styleId="TitleChar" w:customStyle="1">
-    <w:name w:val="Title Char"/>
-    <w:basedOn w:val="DefaultParagraphFont"/>
-    <w:link w:val="Title"/>
-    <w:uiPriority w:val="10"/>
-    <w:rsid w:val="00a10fd9"/>
-    <w:rPr>
-      <w:rFonts w:ascii="Aptos Display" w:hAnsi="Aptos Display" w:eastAsia="" w:cs="" w:asciiTheme="majorHAnsi" w:cstheme="majorBidi" w:eastAsiaTheme="majorEastAsia" w:hAnsiTheme="majorHAnsi"/>
-      <w:sz w:val="56"/>
-      <w:szCs w:val="56"/>
-    </w:rPr>
-  </w:style>
-  <w:style w:type="character" w:styleId="SubtitleChar" w:customStyle="1">
-    <w:name w:val="Subtitle Char"/>
-    <w:basedOn w:val="DefaultParagraphFont"/>
-    <w:link w:val="Subtitle"/>
-    <w:uiPriority w:val="11"/>
-    <w:rsid w:val="00a10fd9"/>
-    <w:rPr>
-      <w:rFonts w:eastAsia="" w:cs="" w:cstheme="majorBidi" w:eastAsiaTheme="majorEastAsia"/>
-      <w:color w:themeColor="text1" w:themeTint="a6" w:val="595959"/>
-      <w:spacing w:val="15"/>
-      <w:sz w:val="28"/>
-      <w:szCs w:val="28"/>
-    </w:rPr>
-  </w:style>
-  <w:style w:type="character" w:styleId="Heading1Char" w:customStyle="1">
-    <w:name w:val="Heading 1 Char"/>
-    <w:basedOn w:val="DefaultParagraphFont"/>
-    <w:link w:val="Heading1"/>
-    <w:uiPriority w:val="9"/>
-    <w:rsid w:val="00a10fd9"/>
-    <w:rPr>
-      <w:rFonts w:ascii="Aptos Display" w:hAnsi="Aptos Display" w:eastAsia="" w:cs="" w:asciiTheme="majorHAnsi" w:cstheme="majorBidi" w:eastAsiaTheme="majorEastAsia" w:hAnsiTheme="majorHAnsi"/>
-      <w:color w:themeColor="accent1" w:themeShade="bf" w:val="0F4761"/>
-      <w:sz w:val="40"/>
-      <w:szCs w:val="40"/>
-    </w:rPr>
-  </w:style>
-  <w:style w:type="character" w:styleId="Heading2Char" w:customStyle="1">
-    <w:name w:val="Heading 2 Char"/>
-    <w:basedOn w:val="DefaultParagraphFont"/>
-    <w:link w:val="Heading2"/>
-    <w:uiPriority w:val="9"/>
-    <w:semiHidden/>
-    <w:rsid w:val="00a10fd9"/>
-    <w:rPr>
-      <w:rFonts w:ascii="Aptos Display" w:hAnsi="Aptos Display" w:eastAsia="" w:cs="" w:asciiTheme="majorHAnsi" w:cstheme="majorBidi" w:eastAsiaTheme="majorEastAsia" w:hAnsiTheme="majorHAnsi"/>
-      <w:color w:themeColor="accent1" w:themeShade="bf" w:val="0F4761"/>
-      <w:sz w:val="32"/>
-      <w:szCs w:val="32"/>
-    </w:rPr>
-  </w:style>
-  <w:style w:type="character" w:styleId="Heading3Char" w:customStyle="1">
-    <w:name w:val="Heading 3 Char"/>
-    <w:basedOn w:val="DefaultParagraphFont"/>
-    <w:link w:val="Heading3"/>
-    <w:uiPriority w:val="9"/>
-    <w:semiHidden/>
-    <w:rsid w:val="00a10fd9"/>
-    <w:rPr>
-      <w:rFonts w:eastAsia="" w:cs="" w:cstheme="majorBidi" w:eastAsiaTheme="majorEastAsia"/>
-      <w:color w:themeColor="accent1" w:themeShade="bf" w:val="0F4761"/>
-      <w:sz w:val="28"/>
-      <w:szCs w:val="28"/>
-    </w:rPr>
-  </w:style>
-  <w:style w:type="character" w:styleId="Heading4Char" w:customStyle="1">
-    <w:name w:val="Heading 4 Char"/>
-    <w:basedOn w:val="DefaultParagraphFont"/>
-    <w:link w:val="Heading4"/>
-    <w:uiPriority w:val="9"/>
-    <w:semiHidden/>
-    <w:rsid w:val="00a10fd9"/>
-    <w:rPr>
-      <w:rFonts w:eastAsia="" w:cs="" w:cstheme="majorBidi" w:eastAsiaTheme="majorEastAsia"/>
-      <w:i/>
-      <w:iCs/>
-      <w:color w:themeColor="accent1" w:themeShade="bf" w:val="0F4761"/>
-    </w:rPr>
-  </w:style>
-  <w:style w:type="character" w:styleId="Heading5Char" w:customStyle="1">
-    <w:name w:val="Heading 5 Char"/>
-    <w:basedOn w:val="DefaultParagraphFont"/>
-    <w:link w:val="Heading5"/>
-    <w:uiPriority w:val="9"/>
-    <w:semiHidden/>
-    <w:rsid w:val="00a10fd9"/>
-    <w:rPr>
-      <w:rFonts w:eastAsia="" w:cs="" w:cstheme="majorBidi" w:eastAsiaTheme="majorEastAsia"/>
-      <w:color w:themeColor="accent1" w:themeShade="bf" w:val="0F4761"/>
-    </w:rPr>
-  </w:style>
-  <w:style w:type="character" w:styleId="Heading6Char" w:customStyle="1">
-    <w:name w:val="Heading 6 Char"/>
-    <w:basedOn w:val="DefaultParagraphFont"/>
-    <w:link w:val="Heading6"/>
-    <w:uiPriority w:val="9"/>
-    <w:semiHidden/>
-    <w:rsid w:val="00a10fd9"/>
-    <w:rPr>
-      <w:rFonts w:eastAsia="" w:cs="" w:cstheme="majorBidi" w:eastAsiaTheme="majorEastAsia"/>
-      <w:i/>
-      <w:iCs/>
-      <w:color w:themeColor="text1" w:themeTint="a6" w:val="595959"/>
-    </w:rPr>
-  </w:style>
-  <w:style w:type="character" w:styleId="Heading7Char" w:customStyle="1">
-    <w:name w:val="Heading 7 Char"/>
-    <w:basedOn w:val="DefaultParagraphFont"/>
-    <w:link w:val="Heading7"/>
-    <w:uiPriority w:val="9"/>
-    <w:semiHidden/>
-    <w:rsid w:val="00a10fd9"/>
-    <w:rPr>
-      <w:rFonts w:eastAsia="" w:cs="" w:cstheme="majorBidi" w:eastAsiaTheme="majorEastAsia"/>
-      <w:color w:themeColor="text1" w:themeTint="a6" w:val="595959"/>
-    </w:rPr>
-  </w:style>
-  <w:style w:type="character" w:styleId="Heading8Char" w:customStyle="1">
-    <w:name w:val="Heading 8 Char"/>
-    <w:basedOn w:val="DefaultParagraphFont"/>
-    <w:link w:val="Heading8"/>
-    <w:uiPriority w:val="9"/>
-    <w:semiHidden/>
-    <w:rsid w:val="00a10fd9"/>
-    <w:rPr>
-      <w:rFonts w:eastAsia="" w:cs="" w:cstheme="majorBidi" w:eastAsiaTheme="majorEastAsia"/>
-      <w:i/>
-      <w:iCs/>
-      <w:color w:themeColor="text1" w:themeTint="d8" w:val="272727"/>
-    </w:rPr>
-  </w:style>
-  <w:style w:type="character" w:styleId="Heading9Char" w:customStyle="1">
-    <w:name w:val="Heading 9 Char"/>
-    <w:basedOn w:val="DefaultParagraphFont"/>
-    <w:link w:val="Heading9"/>
-    <w:uiPriority w:val="9"/>
-    <w:semiHidden/>
-    <w:rsid w:val="00a10fd9"/>
-    <w:rPr>
-      <w:rFonts w:eastAsia="" w:cs="" w:cstheme="majorBidi" w:eastAsiaTheme="majorEastAsia"/>
-      <w:color w:themeColor="text1" w:themeTint="d8" w:val="272727"/>
-    </w:rPr>
-  </w:style>
   <w:style w:type="character" w:styleId="DefaultParagraphFont" w:default="1">
     <w:name w:val="Default Paragraph Font"/>
     <w:semiHidden/>
     <w:unhideWhenUsed/>
+    <w:qFormat/>
     <w:rPr/>
   </w:style>
   <w:style w:type="character" w:styleId="BodyTextChar" w:customStyle="1">
     <w:name w:val="Body Text Char"/>
     <w:basedOn w:val="DefaultParagraphFont"/>
+    <w:qFormat/>
     <w:rPr/>
   </w:style>
   <w:style w:type="character" w:styleId="VerbatimChar" w:customStyle="1">
     <w:name w:val="Verbatim Char"/>
     <w:basedOn w:val="BodyTextChar"/>
+    <w:qFormat/>
     <w:rPr>
       <w:rFonts w:ascii="Consolas" w:hAnsi="Consolas"/>
       <w:sz w:val="22"/>
@@ -2542,17 +2388,19 @@
   <w:style w:type="character" w:styleId="SectionNumber" w:customStyle="1">
     <w:name w:val="Section Number"/>
     <w:basedOn w:val="BodyTextChar"/>
+    <w:qFormat/>
     <w:rPr/>
   </w:style>
-  <w:style w:type="character" w:styleId="FootnoteCharacters">
-    <w:name w:val="Footnote Characters"/>
+  <w:style w:type="character" w:styleId="Style5">
+    <w:name w:val="Символи виноски"/>
     <w:basedOn w:val="BodyTextChar"/>
+    <w:qFormat/>
     <w:rPr>
       <w:vertAlign w:val="superscript"/>
     </w:rPr>
   </w:style>
   <w:style w:type="character" w:styleId="FootnoteReference">
-    <w:name w:val="footnote reference"/>
+    <w:name w:val="Footnote Reference"/>
     <w:rPr>
       <w:vertAlign w:val="superscript"/>
     </w:rPr>
@@ -2564,246 +2412,22 @@
       <w:color w:themeColor="accent1" w:val="4F81BD"/>
     </w:rPr>
   </w:style>
-  <w:style w:type="character" w:styleId="KeywordTok" w:customStyle="1">
-    <w:name w:val="KeywordTok"/>
-    <w:basedOn w:val="VerbatimChar"/>
-    <w:rPr>
-      <w:b/>
-      <w:color w:val="007020"/>
-    </w:rPr>
-  </w:style>
-  <w:style w:type="character" w:styleId="DataTypeTok" w:customStyle="1">
-    <w:name w:val="DataTypeTok"/>
-    <w:basedOn w:val="VerbatimChar"/>
-    <w:rPr>
-      <w:color w:val="902000"/>
-    </w:rPr>
-  </w:style>
-  <w:style w:type="character" w:styleId="DecValTok" w:customStyle="1">
-    <w:name w:val="DecValTok"/>
-    <w:basedOn w:val="VerbatimChar"/>
-    <w:rPr>
-      <w:color w:val="40A070"/>
-    </w:rPr>
-  </w:style>
-  <w:style w:type="character" w:styleId="BaseNTok" w:customStyle="1">
-    <w:name w:val="BaseNTok"/>
-    <w:basedOn w:val="VerbatimChar"/>
-    <w:rPr>
-      <w:color w:val="40A070"/>
-    </w:rPr>
-  </w:style>
-  <w:style w:type="character" w:styleId="FloatTok" w:customStyle="1">
-    <w:name w:val="FloatTok"/>
-    <w:basedOn w:val="VerbatimChar"/>
-    <w:rPr>
-      <w:color w:val="40A070"/>
-    </w:rPr>
-  </w:style>
-  <w:style w:type="character" w:styleId="ConstantTok" w:customStyle="1">
-    <w:name w:val="ConstantTok"/>
-    <w:basedOn w:val="VerbatimChar"/>
-    <w:rPr>
-      <w:color w:val="880000"/>
-    </w:rPr>
-  </w:style>
-  <w:style w:type="character" w:styleId="CharTok" w:customStyle="1">
-    <w:name w:val="CharTok"/>
-    <w:basedOn w:val="VerbatimChar"/>
-    <w:rPr>
-      <w:color w:val="4070A0"/>
-    </w:rPr>
-  </w:style>
-  <w:style w:type="character" w:styleId="SpecialCharTok" w:customStyle="1">
-    <w:name w:val="SpecialCharTok"/>
-    <w:basedOn w:val="VerbatimChar"/>
-    <w:rPr>
-      <w:color w:val="4070A0"/>
-    </w:rPr>
-  </w:style>
-  <w:style w:type="character" w:styleId="StringTok" w:customStyle="1">
-    <w:name w:val="StringTok"/>
-    <w:basedOn w:val="VerbatimChar"/>
-    <w:rPr>
-      <w:color w:val="4070A0"/>
-    </w:rPr>
-  </w:style>
-  <w:style w:type="character" w:styleId="VerbatimStringTok" w:customStyle="1">
-    <w:name w:val="VerbatimStringTok"/>
-    <w:basedOn w:val="VerbatimChar"/>
-    <w:rPr>
-      <w:color w:val="4070A0"/>
-    </w:rPr>
-  </w:style>
-  <w:style w:type="character" w:styleId="SpecialStringTok" w:customStyle="1">
-    <w:name w:val="SpecialStringTok"/>
-    <w:basedOn w:val="VerbatimChar"/>
-    <w:rPr>
-      <w:color w:val="BB6688"/>
-    </w:rPr>
-  </w:style>
-  <w:style w:type="character" w:styleId="ImportTok" w:customStyle="1">
-    <w:name w:val="ImportTok"/>
-    <w:basedOn w:val="VerbatimChar"/>
-    <w:rPr>
-      <w:b/>
-      <w:color w:val="008000"/>
-    </w:rPr>
-  </w:style>
-  <w:style w:type="character" w:styleId="CommentTok" w:customStyle="1">
-    <w:name w:val="CommentTok"/>
-    <w:basedOn w:val="VerbatimChar"/>
-    <w:rPr>
-      <w:i/>
-      <w:color w:val="60A0B0"/>
-    </w:rPr>
-  </w:style>
-  <w:style w:type="character" w:styleId="DocumentationTok" w:customStyle="1">
-    <w:name w:val="DocumentationTok"/>
-    <w:basedOn w:val="VerbatimChar"/>
-    <w:rPr>
-      <w:i/>
-      <w:color w:val="BA2121"/>
-    </w:rPr>
-  </w:style>
-  <w:style w:type="character" w:styleId="AnnotationTok" w:customStyle="1">
-    <w:name w:val="AnnotationTok"/>
-    <w:basedOn w:val="VerbatimChar"/>
-    <w:rPr>
-      <w:b/>
-      <w:i/>
-      <w:color w:val="60A0B0"/>
-    </w:rPr>
-  </w:style>
-  <w:style w:type="character" w:styleId="CommentVarTok" w:customStyle="1">
-    <w:name w:val="CommentVarTok"/>
-    <w:basedOn w:val="VerbatimChar"/>
-    <w:rPr>
-      <w:b/>
-      <w:i/>
-      <w:color w:val="60A0B0"/>
-    </w:rPr>
-  </w:style>
-  <w:style w:type="character" w:styleId="OtherTok" w:customStyle="1">
-    <w:name w:val="OtherTok"/>
-    <w:basedOn w:val="VerbatimChar"/>
-    <w:rPr>
-      <w:color w:val="007020"/>
-    </w:rPr>
-  </w:style>
-  <w:style w:type="character" w:styleId="FunctionTok" w:customStyle="1">
-    <w:name w:val="FunctionTok"/>
-    <w:basedOn w:val="VerbatimChar"/>
-    <w:rPr>
-      <w:color w:val="06287E"/>
-    </w:rPr>
-  </w:style>
-  <w:style w:type="character" w:styleId="VariableTok" w:customStyle="1">
-    <w:name w:val="VariableTok"/>
-    <w:basedOn w:val="VerbatimChar"/>
-    <w:rPr>
-      <w:color w:val="19177C"/>
-    </w:rPr>
-  </w:style>
-  <w:style w:type="character" w:styleId="ControlFlowTok" w:customStyle="1">
-    <w:name w:val="ControlFlowTok"/>
-    <w:basedOn w:val="VerbatimChar"/>
-    <w:rPr>
-      <w:b/>
-      <w:color w:val="007020"/>
-    </w:rPr>
-  </w:style>
-  <w:style w:type="character" w:styleId="OperatorTok" w:customStyle="1">
-    <w:name w:val="OperatorTok"/>
-    <w:basedOn w:val="VerbatimChar"/>
-    <w:rPr>
-      <w:color w:val="666666"/>
-    </w:rPr>
-  </w:style>
-  <w:style w:type="character" w:styleId="BuiltInTok" w:customStyle="1">
-    <w:name w:val="BuiltInTok"/>
-    <w:basedOn w:val="VerbatimChar"/>
-    <w:rPr>
-      <w:color w:val="008000"/>
-    </w:rPr>
-  </w:style>
-  <w:style w:type="character" w:styleId="ExtensionTok" w:customStyle="1">
-    <w:name w:val="ExtensionTok"/>
-    <w:basedOn w:val="VerbatimChar"/>
+  <w:style w:type="character" w:styleId="Style6">
+    <w:name w:val="Посилання покажчика"/>
+    <w:qFormat/>
     <w:rPr/>
   </w:style>
-  <w:style w:type="character" w:styleId="PreprocessorTok" w:customStyle="1">
-    <w:name w:val="PreprocessorTok"/>
-    <w:basedOn w:val="VerbatimChar"/>
-    <w:rPr>
-      <w:color w:val="BC7A00"/>
-    </w:rPr>
-  </w:style>
-  <w:style w:type="character" w:styleId="AttributeTok" w:customStyle="1">
-    <w:name w:val="AttributeTok"/>
-    <w:basedOn w:val="VerbatimChar"/>
-    <w:rPr>
-      <w:color w:val="7D9029"/>
-    </w:rPr>
-  </w:style>
-  <w:style w:type="character" w:styleId="RegionMarkerTok" w:customStyle="1">
-    <w:name w:val="RegionMarkerTok"/>
-    <w:basedOn w:val="VerbatimChar"/>
-    <w:rPr/>
-  </w:style>
-  <w:style w:type="character" w:styleId="InformationTok" w:customStyle="1">
-    <w:name w:val="InformationTok"/>
-    <w:basedOn w:val="VerbatimChar"/>
-    <w:rPr>
-      <w:b/>
-      <w:i/>
-      <w:color w:val="60A0B0"/>
-    </w:rPr>
-  </w:style>
-  <w:style w:type="character" w:styleId="WarningTok" w:customStyle="1">
-    <w:name w:val="WarningTok"/>
-    <w:basedOn w:val="VerbatimChar"/>
-    <w:rPr>
-      <w:b/>
-      <w:i/>
-      <w:color w:val="60A0B0"/>
-    </w:rPr>
-  </w:style>
-  <w:style w:type="character" w:styleId="AlertTok" w:customStyle="1">
-    <w:name w:val="AlertTok"/>
-    <w:basedOn w:val="VerbatimChar"/>
-    <w:rPr>
-      <w:b/>
-      <w:color w:val="FF0000"/>
-    </w:rPr>
-  </w:style>
-  <w:style w:type="character" w:styleId="ErrorTok" w:customStyle="1">
-    <w:name w:val="ErrorTok"/>
-    <w:basedOn w:val="VerbatimChar"/>
-    <w:rPr>
-      <w:b/>
-      <w:color w:val="FF0000"/>
-    </w:rPr>
-  </w:style>
-  <w:style w:type="character" w:styleId="NormalTok" w:customStyle="1">
-    <w:name w:val="NormalTok"/>
-    <w:basedOn w:val="VerbatimChar"/>
-    <w:rPr/>
-  </w:style>
-  <w:style w:type="character" w:styleId="IndexLink">
-    <w:name w:val="Index Link"/>
-    <w:rPr/>
-  </w:style>
-  <w:style w:type="paragraph" w:styleId="Heading">
-    <w:name w:val="Heading"/>
-    <w:basedOn w:val="Normal"/>
-    <w:next w:val="BodyText"/>
+  <w:style w:type="paragraph" w:styleId="Style7">
+    <w:name w:val="Заголовок"/>
+    <w:basedOn w:val="Normal"/>
+    <w:next w:val="BodyText"/>
+    <w:qFormat/>
     <w:pPr>
       <w:keepNext w:val="true"/>
       <w:spacing w:before="240" w:after="120"/>
     </w:pPr>
     <w:rPr>
-      <w:rFonts w:ascii="Liberation Sans" w:hAnsi="Liberation Sans" w:eastAsia="Noto Sans SC" w:cs="Noto Sans"/>
+      <w:rFonts w:ascii="Liberation Sans" w:hAnsi="Liberation Sans" w:eastAsia="Noto Sans CJK SC" w:cs="FreeSans"/>
       <w:sz w:val="28"/>
       <w:szCs w:val="28"/>
     </w:rPr>
@@ -2831,13 +2455,14 @@
     <w:basedOn w:val="BodyText"/>
     <w:pPr/>
     <w:rPr>
-      <w:rFonts w:cs="Noto Sans"/>
+      <w:rFonts w:cs="FreeSans"/>
     </w:rPr>
   </w:style>
   <w:style w:type="paragraph" w:styleId="Caption">
-    <w:name w:val="caption"/>
+    <w:name w:val="Caption"/>
     <w:basedOn w:val="Normal"/>
     <w:link w:val="BodyTextChar"/>
+    <w:qFormat/>
     <w:pPr>
       <w:spacing w:before="0" w:after="120"/>
     </w:pPr>
@@ -2845,14 +2470,15 @@
       <w:i/>
     </w:rPr>
   </w:style>
-  <w:style w:type="paragraph" w:styleId="Index">
-    <w:name w:val="Index"/>
-    <w:basedOn w:val="Normal"/>
+  <w:style w:type="paragraph" w:styleId="Style8">
+    <w:name w:val="Покажчик"/>
+    <w:basedOn w:val="Normal"/>
+    <w:qFormat/>
     <w:pPr>
       <w:suppressLineNumbers/>
     </w:pPr>
     <w:rPr>
-      <w:rFonts w:cs="Noto Sans"/>
+      <w:rFonts w:cs="FreeSans"/>
     </w:rPr>
   </w:style>
   <w:style w:type="paragraph" w:styleId="FirstParagraph" w:customStyle="1">
@@ -2894,63 +2520,80 @@
     <w:name w:val="Title"/>
     <w:basedOn w:val="Normal"/>
     <w:next w:val="BodyText"/>
-    <w:link w:val="TitleChar"/>
-    <w:uiPriority w:val="10"/>
-    <w:qFormat/>
-    <w:rsid w:val="00a10fd9"/>
-    <w:pPr>
-      <w:spacing w:lineRule="auto" w:line="240" w:before="0" w:after="80"/>
-      <w:contextualSpacing/>
+    <w:qFormat/>
+    <w:pPr>
+      <w:keepNext w:val="true"/>
+      <w:keepLines/>
+      <w:spacing w:before="480" w:after="240"/>
       <w:jc w:val="center"/>
     </w:pPr>
     <w:rPr>
-      <w:rFonts w:ascii="Aptos Display" w:hAnsi="Aptos Display" w:eastAsia="" w:cs="" w:asciiTheme="majorHAnsi" w:cstheme="majorBidi" w:eastAsiaTheme="majorEastAsia" w:hAnsiTheme="majorHAnsi"/>
-      <w:sz w:val="56"/>
-      <w:szCs w:val="56"/>
+      <w:rFonts w:ascii="Calibri" w:hAnsi="Calibri" w:eastAsia="" w:cs="" w:asciiTheme="majorHAnsi" w:cstheme="majorBidi" w:eastAsiaTheme="majorEastAsia" w:hAnsiTheme="majorHAnsi"/>
+      <w:b/>
+      <w:bCs/>
+      <w:color w:themeColor="accent1" w:themeShade="b5" w:val="345A8A"/>
+      <w:sz w:val="36"/>
+      <w:szCs w:val="36"/>
     </w:rPr>
   </w:style>
   <w:style w:type="paragraph" w:styleId="Subtitle">
     <w:name w:val="Subtitle"/>
     <w:basedOn w:val="Title"/>
     <w:next w:val="BodyText"/>
-    <w:link w:val="SubtitleChar"/>
-    <w:uiPriority w:val="11"/>
-    <w:qFormat/>
-    <w:rsid w:val="00a10fd9"/>
-    <w:pPr/>
-    <w:rPr>
-      <w:rFonts w:eastAsia="" w:cs="" w:cstheme="majorBidi" w:eastAsiaTheme="majorEastAsia"/>
-      <w:spacing w:val="15"/>
-      <w:sz w:val="28"/>
-      <w:szCs w:val="28"/>
+    <w:qFormat/>
+    <w:pPr>
+      <w:keepNext w:val="true"/>
+      <w:keepLines/>
+      <w:spacing w:before="240" w:after="240"/>
+      <w:jc w:val="center"/>
+    </w:pPr>
+    <w:rPr>
+      <w:sz w:val="30"/>
+      <w:szCs w:val="30"/>
     </w:rPr>
   </w:style>
   <w:style w:type="paragraph" w:styleId="Author" w:customStyle="1">
     <w:name w:val="Author"/>
-    <w:basedOn w:val="Title"/>
     <w:next w:val="BodyText"/>
     <w:qFormat/>
     <w:pPr>
       <w:keepNext w:val="true"/>
       <w:keepLines/>
-    </w:pPr>
-    <w:rPr>
-      <w:sz w:val="24"/>
-      <w:szCs w:val="24"/>
+      <w:widowControl/>
+      <w:bidi w:val="0"/>
+      <w:spacing w:lineRule="auto" w:line="360" w:before="0" w:after="0"/>
+      <w:ind w:firstLine="709"/>
+      <w:jc w:val="center"/>
+    </w:pPr>
+    <w:rPr>
+      <w:rFonts w:ascii="Times New Roman" w:hAnsi="Times New Roman" w:eastAsia="Times New Roman" w:cs="Times New Roman"/>
+      <w:color w:val="000000"/>
+      <w:kern w:val="0"/>
+      <w:sz w:val="28"/>
+      <w:szCs w:val="28"/>
+      <w:lang w:val="uk-UA" w:eastAsia="zh-CN" w:bidi="hi-IN"/>
     </w:rPr>
   </w:style>
   <w:style w:type="paragraph" w:styleId="Date">
     <w:name w:val="Date"/>
-    <w:basedOn w:val="Title"/>
     <w:next w:val="BodyText"/>
     <w:qFormat/>
     <w:pPr>
       <w:keepNext w:val="true"/>
       <w:keepLines/>
-    </w:pPr>
-    <w:rPr>
-      <w:sz w:val="24"/>
-      <w:szCs w:val="24"/>
+      <w:widowControl/>
+      <w:bidi w:val="0"/>
+      <w:spacing w:lineRule="auto" w:line="360" w:before="0" w:after="0"/>
+      <w:ind w:firstLine="709"/>
+      <w:jc w:val="center"/>
+    </w:pPr>
+    <w:rPr>
+      <w:rFonts w:ascii="Times New Roman" w:hAnsi="Times New Roman" w:eastAsia="Times New Roman" w:cs="Times New Roman"/>
+      <w:color w:val="000000"/>
+      <w:kern w:val="0"/>
+      <w:sz w:val="28"/>
+      <w:szCs w:val="28"/>
+      <w:lang w:val="uk-UA" w:eastAsia="zh-CN" w:bidi="hi-IN"/>
     </w:rPr>
   </w:style>
   <w:style w:type="paragraph" w:styleId="AbstractTitle" w:customStyle="1">
@@ -2966,6 +2609,7 @@
     </w:pPr>
     <w:rPr>
       <w:b/>
+      <w:color w:val="345A8A"/>
       <w:sz w:val="20"/>
       <w:szCs w:val="20"/>
     </w:rPr>
@@ -2985,21 +2629,141 @@
       <w:szCs w:val="20"/>
     </w:rPr>
   </w:style>
-  <w:style w:type="paragraph" w:styleId="FootnoteBlockText">
-    <w:name w:val="Footnote Block Text"/>
-    <w:basedOn w:val="FootnoteText"/>
-    <w:next w:val="FootnoteText"/>
-    <w:uiPriority w:val="9"/>
-    <w:unhideWhenUsed/>
-    <w:qFormat/>
-    <w:pPr>
-      <w:spacing w:before="100" w:after="100"/>
-      <w:ind w:hanging="0" w:left="480" w:right="480"/>
-    </w:pPr>
+  <w:style w:type="paragraph" w:styleId="DefinitionTerm" w:customStyle="1">
+    <w:name w:val="Definition Term"/>
+    <w:basedOn w:val="Normal"/>
+    <w:next w:val="Definition"/>
+    <w:qFormat/>
+    <w:pPr>
+      <w:keepNext w:val="true"/>
+      <w:keepLines/>
+      <w:spacing w:before="0" w:after="0"/>
+    </w:pPr>
+    <w:rPr>
+      <w:b/>
+    </w:rPr>
+  </w:style>
+  <w:style w:type="paragraph" w:styleId="Definition" w:customStyle="1">
+    <w:name w:val="Definition"/>
+    <w:basedOn w:val="Normal"/>
+    <w:qFormat/>
+    <w:pPr/>
     <w:rPr/>
   </w:style>
+  <w:style w:type="paragraph" w:styleId="TableCaption" w:customStyle="1">
+    <w:name w:val="Table Caption"/>
+    <w:basedOn w:val="Normal"/>
+    <w:next w:val="BodyText"/>
+    <w:qFormat/>
+    <w:pPr>
+      <w:keepNext w:val="true"/>
+      <w:widowControl/>
+      <w:spacing w:lineRule="auto" w:line="360" w:before="0" w:after="0"/>
+      <w:ind w:firstLine="709"/>
+      <w:jc w:val="left"/>
+    </w:pPr>
+    <w:rPr>
+      <w:rFonts w:ascii="Times New Roman" w:hAnsi="Times New Roman" w:eastAsia="Times New Roman" w:cs="Times New Roman"/>
+      <w:color w:val="000000"/>
+      <w:sz w:val="28"/>
+      <w:szCs w:val="28"/>
+    </w:rPr>
+  </w:style>
+  <w:style w:type="paragraph" w:styleId="ImageCaption" w:customStyle="1">
+    <w:name w:val="Image Caption"/>
+    <w:basedOn w:val="Normal"/>
+    <w:next w:val="BodyText"/>
+    <w:qFormat/>
+    <w:pPr>
+      <w:widowControl/>
+      <w:spacing w:lineRule="auto" w:line="360" w:before="0" w:after="0"/>
+      <w:ind w:hanging="0"/>
+      <w:jc w:val="center"/>
+    </w:pPr>
+    <w:rPr>
+      <w:rFonts w:ascii="Times New Roman" w:hAnsi="Times New Roman" w:eastAsia="Times New Roman" w:cs="Times New Roman"/>
+      <w:color w:val="000000"/>
+      <w:sz w:val="28"/>
+      <w:szCs w:val="28"/>
+    </w:rPr>
+  </w:style>
+  <w:style w:type="paragraph" w:styleId="CaptionedFigure" w:customStyle="1">
+    <w:name w:val="Captioned Figure"/>
+    <w:basedOn w:val="Normal"/>
+    <w:next w:val="BodyText"/>
+    <w:qFormat/>
+    <w:pPr>
+      <w:keepNext w:val="true"/>
+      <w:widowControl/>
+      <w:spacing w:lineRule="auto" w:line="360" w:before="0" w:after="0"/>
+      <w:ind w:hanging="0"/>
+      <w:jc w:val="center"/>
+    </w:pPr>
+    <w:rPr>
+      <w:rFonts w:ascii="Times New Roman" w:hAnsi="Times New Roman" w:eastAsia="Times New Roman" w:cs="Times New Roman"/>
+      <w:color w:val="000000"/>
+      <w:sz w:val="28"/>
+      <w:szCs w:val="28"/>
+    </w:rPr>
+  </w:style>
+  <w:style w:type="paragraph" w:styleId="Style9" w:customStyle="1">
+    <w:name w:val="Фігура"/>
+    <w:basedOn w:val="Normal"/>
+    <w:next w:val="BodyText"/>
+    <w:qFormat/>
+    <w:pPr>
+      <w:widowControl/>
+      <w:spacing w:lineRule="auto" w:line="360" w:before="0" w:after="0"/>
+      <w:ind w:hanging="0"/>
+      <w:jc w:val="center"/>
+    </w:pPr>
+    <w:rPr>
+      <w:rFonts w:ascii="Times New Roman" w:hAnsi="Times New Roman" w:eastAsia="Times New Roman" w:cs="Times New Roman"/>
+      <w:color w:val="000000"/>
+      <w:sz w:val="28"/>
+      <w:szCs w:val="28"/>
+    </w:rPr>
+  </w:style>
+  <w:style w:type="paragraph" w:styleId="SourceCode" w:customStyle="1">
+    <w:name w:val="Source Code"/>
+    <w:basedOn w:val="Normal"/>
+    <w:next w:val="BodyText"/>
+    <w:qFormat/>
+    <w:pPr>
+      <w:widowControl/>
+      <w:spacing w:lineRule="auto" w:line="240" w:before="0" w:after="0"/>
+      <w:ind w:hanging="0"/>
+      <w:jc w:val="left"/>
+    </w:pPr>
+    <w:rPr>
+      <w:rFonts w:ascii="Courier New" w:hAnsi="Courier New" w:eastAsia="Courier New" w:cs="Courier New"/>
+      <w:b/>
+      <w:bCs/>
+      <w:color w:val="000000"/>
+      <w:sz w:val="22"/>
+      <w:szCs w:val="22"/>
+    </w:rPr>
+  </w:style>
+  <w:style w:type="paragraph" w:styleId="Bibliography" w:customStyle="1">
+    <w:name w:val="Bibliography"/>
+    <w:basedOn w:val="Normal"/>
+    <w:next w:val="BodyText"/>
+    <w:qFormat/>
+    <w:pPr>
+      <w:widowControl/>
+      <w:spacing w:lineRule="auto" w:line="360" w:before="0" w:after="0"/>
+      <w:ind w:firstLine="709"/>
+      <w:jc w:val="both"/>
+    </w:pPr>
+    <w:rPr>
+      <w:rFonts w:ascii="Times New Roman" w:hAnsi="Times New Roman" w:eastAsia="Times New Roman" w:cs="Times New Roman"/>
+      <w:color w:val="000000"/>
+      <w:sz w:val="28"/>
+      <w:szCs w:val="28"/>
+    </w:rPr>
+  </w:style>
   <w:style w:type="paragraph" w:styleId="FootnoteText" w:customStyle="1">
-    <w:name w:val="footnote text"/>
+    <w:name w:val="Footnote Text"/>
     <w:basedOn w:val="Normal"/>
     <w:next w:val="BodyText"/>
     <w:qFormat/>
@@ -3016,117 +2780,6 @@
       <w:szCs w:val="24"/>
     </w:rPr>
   </w:style>
-  <w:style w:type="paragraph" w:styleId="DefinitionTerm" w:customStyle="1">
-    <w:name w:val="Definition Term"/>
-    <w:basedOn w:val="Normal"/>
-    <w:next w:val="Definition"/>
-    <w:pPr>
-      <w:keepNext w:val="true"/>
-      <w:keepLines/>
-      <w:spacing w:before="0" w:after="0"/>
-    </w:pPr>
-    <w:rPr>
-      <w:b/>
-    </w:rPr>
-  </w:style>
-  <w:style w:type="paragraph" w:styleId="Definition" w:customStyle="1">
-    <w:name w:val="Definition"/>
-    <w:basedOn w:val="Normal"/>
-    <w:pPr/>
-    <w:rPr/>
-  </w:style>
-  <w:style w:type="paragraph" w:styleId="TableCaption" w:customStyle="1">
-    <w:name w:val="Table Caption"/>
-    <w:basedOn w:val="Normal"/>
-    <w:next w:val="BodyText"/>
-    <w:qFormat/>
-    <w:pPr>
-      <w:keepNext w:val="true"/>
-      <w:widowControl/>
-      <w:spacing w:lineRule="auto" w:line="360" w:before="0" w:after="0"/>
-      <w:ind w:firstLine="709"/>
-      <w:jc w:val="left"/>
-    </w:pPr>
-    <w:rPr>
-      <w:rFonts w:ascii="Times New Roman" w:hAnsi="Times New Roman" w:eastAsia="Times New Roman" w:cs="Times New Roman"/>
-      <w:color w:val="000000"/>
-      <w:sz w:val="28"/>
-      <w:szCs w:val="28"/>
-    </w:rPr>
-  </w:style>
-  <w:style w:type="paragraph" w:styleId="ImageCaption" w:customStyle="1">
-    <w:name w:val="Image Caption"/>
-    <w:basedOn w:val="Normal"/>
-    <w:next w:val="BodyText"/>
-    <w:qFormat/>
-    <w:pPr>
-      <w:widowControl/>
-      <w:spacing w:lineRule="auto" w:line="360" w:before="0" w:after="0"/>
-      <w:ind w:hanging="0"/>
-      <w:jc w:val="center"/>
-    </w:pPr>
-    <w:rPr>
-      <w:rFonts w:ascii="Times New Roman" w:hAnsi="Times New Roman" w:eastAsia="Times New Roman" w:cs="Times New Roman"/>
-      <w:color w:val="000000"/>
-      <w:sz w:val="28"/>
-      <w:szCs w:val="28"/>
-    </w:rPr>
-  </w:style>
-  <w:style w:type="paragraph" w:styleId="CaptionedFigure" w:customStyle="1">
-    <w:name w:val="Captioned Figure"/>
-    <w:basedOn w:val="Normal"/>
-    <w:next w:val="BodyText"/>
-    <w:qFormat/>
-    <w:pPr>
-      <w:keepNext w:val="true"/>
-      <w:widowControl/>
-      <w:spacing w:lineRule="auto" w:line="360" w:before="0" w:after="0"/>
-      <w:ind w:hanging="0"/>
-      <w:jc w:val="center"/>
-    </w:pPr>
-    <w:rPr>
-      <w:rFonts w:ascii="Times New Roman" w:hAnsi="Times New Roman" w:eastAsia="Times New Roman" w:cs="Times New Roman"/>
-      <w:color w:val="000000"/>
-      <w:sz w:val="28"/>
-      <w:szCs w:val="28"/>
-    </w:rPr>
-  </w:style>
-  <w:style w:type="paragraph" w:styleId="Figure" w:customStyle="1">
-    <w:name w:val="Figure"/>
-    <w:basedOn w:val="Normal"/>
-    <w:next w:val="BodyText"/>
-    <w:qFormat/>
-    <w:pPr>
-      <w:widowControl/>
-      <w:spacing w:lineRule="auto" w:line="360" w:before="0" w:after="0"/>
-      <w:ind w:hanging="0"/>
-      <w:jc w:val="center"/>
-    </w:pPr>
-    <w:rPr>
-      <w:rFonts w:ascii="Times New Roman" w:hAnsi="Times New Roman" w:eastAsia="Times New Roman" w:cs="Times New Roman"/>
-      <w:color w:val="000000"/>
-      <w:sz w:val="28"/>
-      <w:szCs w:val="28"/>
-    </w:rPr>
-  </w:style>
-  <w:style w:type="paragraph" w:styleId="Bibliography" w:customStyle="1">
-    <w:name w:val="Bibliography"/>
-    <w:basedOn w:val="Normal"/>
-    <w:next w:val="BodyText"/>
-    <w:qFormat/>
-    <w:pPr>
-      <w:widowControl/>
-      <w:spacing w:lineRule="auto" w:line="360" w:before="0" w:after="0"/>
-      <w:ind w:firstLine="709"/>
-      <w:jc w:val="both"/>
-    </w:pPr>
-    <w:rPr>
-      <w:rFonts w:ascii="Times New Roman" w:hAnsi="Times New Roman" w:eastAsia="Times New Roman" w:cs="Times New Roman"/>
-      <w:color w:val="000000"/>
-      <w:sz w:val="28"/>
-      <w:szCs w:val="28"/>
-    </w:rPr>
-  </w:style>
   <w:style w:type="paragraph" w:styleId="BlockText" w:customStyle="1">
     <w:name w:val="Block Text"/>
     <w:basedOn w:val="Normal"/>
@@ -3146,8 +2799,8 @@
     </w:rPr>
   </w:style>
   <w:style w:type="paragraph" w:styleId="IndexHeading">
-    <w:name w:val="index heading"/>
-    <w:basedOn w:val="Heading"/>
+    <w:name w:val="Index Heading"/>
+    <w:basedOn w:val="Style7"/>
     <w:pPr/>
     <w:rPr/>
   </w:style>
@@ -3453,14 +3106,16 @@
     </w:rPr>
   </w:style>
   <w:style w:type="paragraph" w:styleId="TOC1">
-    <w:name w:val="toc 1"/>
-    <w:basedOn w:val="Normal"/>
-    <w:pPr>
+    <w:name w:val="TOC 1"/>
+    <w:basedOn w:val="Normal"/>
+    <w:pPr>
+      <w:widowControl/>
       <w:tabs>
         <w:tab w:val="right" w:pos="9922" w:leader="dot"/>
       </w:tabs>
       <w:spacing w:lineRule="auto" w:line="360" w:before="0" w:after="0"/>
       <w:ind w:hanging="0" w:left="0"/>
+      <w:jc w:val="both"/>
     </w:pPr>
     <w:rPr>
       <w:rFonts w:ascii="Times New Roman" w:hAnsi="Times New Roman" w:eastAsia="Times New Roman" w:cs="Times New Roman"/>
@@ -3470,14 +3125,16 @@
     </w:rPr>
   </w:style>
   <w:style w:type="paragraph" w:styleId="TOC2">
-    <w:name w:val="toc 2"/>
-    <w:basedOn w:val="Normal"/>
-    <w:pPr>
+    <w:name w:val="TOC 2"/>
+    <w:basedOn w:val="Normal"/>
+    <w:pPr>
+      <w:widowControl/>
       <w:tabs>
         <w:tab w:val="right" w:pos="9922" w:leader="dot"/>
       </w:tabs>
       <w:spacing w:lineRule="auto" w:line="360" w:before="0" w:after="0"/>
       <w:ind w:hanging="0" w:left="709"/>
+      <w:jc w:val="both"/>
     </w:pPr>
     <w:rPr>
       <w:rFonts w:ascii="Times New Roman" w:hAnsi="Times New Roman" w:eastAsia="Times New Roman" w:cs="Times New Roman"/>
@@ -3487,37 +3144,33 @@
     </w:rPr>
   </w:style>
   <w:style w:type="paragraph" w:styleId="TOC3">
-    <w:name w:val="toc 3"/>
-    <w:basedOn w:val="Normal"/>
-    <w:pPr>
+    <w:name w:val="TOC 3"/>
+    <w:basedOn w:val="Normal"/>
+    <w:pPr>
+      <w:widowControl/>
       <w:tabs>
         <w:tab w:val="right" w:pos="9922" w:leader="dot"/>
       </w:tabs>
       <w:spacing w:lineRule="auto" w:line="360" w:before="0" w:after="0"/>
       <w:ind w:hanging="0" w:left="1418"/>
-    </w:pPr>
-    <w:rPr>
-      <w:rFonts w:ascii="Times New Roman" w:hAnsi="Times New Roman" w:eastAsia="Times New Roman" w:cs="Times New Roman"/>
-      <w:color w:val="000000"/>
-      <w:sz w:val="28"/>
-      <w:szCs w:val="28"/>
-    </w:rPr>
-  </w:style>
-  <w:style w:type="paragraph" w:styleId="SourceCode" w:customStyle="1">
-    <w:name w:val="Source Code"/>
-    <w:basedOn w:val="Normal"/>
-    <w:link w:val="VerbatimChar"/>
+      <w:jc w:val="both"/>
+    </w:pPr>
+    <w:rPr>
+      <w:rFonts w:ascii="Times New Roman" w:hAnsi="Times New Roman" w:eastAsia="Times New Roman" w:cs="Times New Roman"/>
+      <w:color w:val="000000"/>
+      <w:sz w:val="28"/>
+      <w:szCs w:val="28"/>
+    </w:rPr>
+  </w:style>
+  <w:style w:type="paragraph" w:styleId="HeaderandFooter">
+    <w:name w:val="Header and Footer"/>
+    <w:basedOn w:val="Normal"/>
+    <w:qFormat/>
     <w:pPr/>
     <w:rPr/>
   </w:style>
-  <w:style w:type="paragraph" w:styleId="HeaderandFooter">
-    <w:name w:val="Header and Footer"/>
-    <w:basedOn w:val="Normal"/>
-    <w:pPr/>
-    <w:rPr/>
-  </w:style>
   <w:style w:type="paragraph" w:styleId="Header">
-    <w:name w:val="header"/>
+    <w:name w:val="Header"/>
     <w:basedOn w:val="HeaderandFooter"/>
     <w:pPr/>
     <w:rPr/>
@@ -3557,143 +3210,49 @@
         <a:srgbClr val="000000"/>
       </a:dk1>
       <a:lt1>
-        <a:srgbClr val="FFFFFF"/>
+        <a:srgbClr val="ffffff"/>
       </a:lt1>
       <a:dk2>
-        <a:srgbClr val="0E2841"/>
+        <a:srgbClr val="1f497d"/>
       </a:dk2>
       <a:lt2>
-        <a:srgbClr val="E8E8E8"/>
+        <a:srgbClr val="eeece1"/>
       </a:lt2>
       <a:accent1>
-        <a:srgbClr val="156082"/>
+        <a:srgbClr val="4f81bd"/>
       </a:accent1>
       <a:accent2>
-        <a:srgbClr val="E97132"/>
+        <a:srgbClr val="c0504d"/>
       </a:accent2>
       <a:accent3>
-        <a:srgbClr val="196B24"/>
+        <a:srgbClr val="9bbb59"/>
       </a:accent3>
       <a:accent4>
-        <a:srgbClr val="0F9ED5"/>
+        <a:srgbClr val="8064a2"/>
       </a:accent4>
       <a:accent5>
-        <a:srgbClr val="A02B93"/>
+        <a:srgbClr val="4bacc6"/>
       </a:accent5>
       <a:accent6>
-        <a:srgbClr val="4EA72E"/>
+        <a:srgbClr val="f79646"/>
       </a:accent6>
       <a:hlink>
-        <a:srgbClr val="467886"/>
+        <a:srgbClr val="0000ff"/>
       </a:hlink>
       <a:folHlink>
-        <a:srgbClr val="96607D"/>
+        <a:srgbClr val="800080"/>
       </a:folHlink>
     </a:clrScheme>
     <a:fontScheme name="Office">
       <a:majorFont>
-        <a:latin typeface="Aptos Display" panose="02110004020202020204" pitchFamily="0" charset="1"/>
+        <a:latin typeface="Calibri" pitchFamily="0" charset="1"/>
         <a:ea typeface=""/>
         <a:cs typeface=""/>
-        <a:font script="Jpan" typeface="游ゴシック Light"/>
-        <a:font script="Hang" typeface="맑은 고딕"/>
-        <a:font script="Hans" typeface="等线 Light"/>
-        <a:font script="Hant" typeface="新細明體"/>
-        <a:font script="Arab" typeface="Times New Roman"/>
-        <a:font script="Hebr" typeface="Times New Roman"/>
-        <a:font script="Thai" typeface="Angsana New"/>
-        <a:font script="Ethi" typeface="Nyala"/>
-        <a:font script="Beng" typeface="Vrinda"/>
-        <a:font script="Gujr" typeface="Shruti"/>
-        <a:font script="Khmr" typeface="MoolBoran"/>
-        <a:font script="Knda" typeface="Tunga"/>
-        <a:font script="Guru" typeface="Raavi"/>
-        <a:font script="Cans" typeface="Euphemia"/>
-        <a:font script="Cher" typeface="Plantagenet Cherokee"/>
-        <a:font script="Yiii" typeface="Microsoft Yi Baiti"/>
-        <a:font script="Tibt" typeface="Microsoft Himalaya"/>
-        <a:font script="Thaa" typeface="MV Boli"/>
-        <a:font script="Deva" typeface="Mangal"/>
-        <a:font script="Telu" typeface="Gautami"/>
-        <a:font script="Taml" typeface="Latha"/>
-        <a:font script="Syrc" typeface="Estrangelo Edessa"/>
-        <a:font script="Orya" typeface="Kalinga"/>
-        <a:font script="Mlym" typeface="Kartika"/>
-        <a:font script="Laoo" typeface="DokChampa"/>
-        <a:font script="Sinh" typeface="Iskoola Pota"/>
-        <a:font script="Mong" typeface="Mongolian Baiti"/>
-        <a:font script="Viet" typeface="Times New Roman"/>
-        <a:font script="Uigh" typeface="Microsoft Uighur"/>
-        <a:font script="Geor" typeface="Sylfaen"/>
-        <a:font script="Armn" typeface="Arial"/>
-        <a:font script="Bugi" typeface="Leelawadee UI"/>
-        <a:font script="Bopo" typeface="Microsoft JhengHei"/>
-        <a:font script="Java" typeface="Javanese Text"/>
-        <a:font script="Lisu" typeface="Segoe UI"/>
-        <a:font script="Mymr" typeface="Myanmar Text"/>
-        <a:font script="Nkoo" typeface="Ebrima"/>
-        <a:font script="Olck" typeface="Nirmala UI"/>
-        <a:font script="Osma" typeface="Ebrima"/>
-        <a:font script="Phag" typeface="Phagspa"/>
-        <a:font script="Syrn" typeface="Estrangelo Edessa"/>
-        <a:font script="Syrj" typeface="Estrangelo Edessa"/>
-        <a:font script="Syre" typeface="Estrangelo Edessa"/>
-        <a:font script="Sora" typeface="Nirmala UI"/>
-        <a:font script="Tale" typeface="Microsoft Tai Le"/>
-        <a:font script="Talu" typeface="Microsoft New Tai Lue"/>
-        <a:font script="Tfng" typeface="Ebrima"/>
       </a:majorFont>
       <a:minorFont>
-        <a:latin typeface="Aptos" panose="02110004020202020204" pitchFamily="0" charset="1"/>
+        <a:latin typeface="Cambria" pitchFamily="0" charset="1"/>
         <a:ea typeface=""/>
         <a:cs typeface=""/>
-        <a:font script="Jpan" typeface="游明朝"/>
-        <a:font script="Hang" typeface="맑은 고딕"/>
-        <a:font script="Hans" typeface="等线"/>
-        <a:font script="Hant" typeface="新細明體"/>
-        <a:font script="Arab" typeface="Arial"/>
-        <a:font script="Hebr" typeface="Arial"/>
-        <a:font script="Thai" typeface="Cordia New"/>
-        <a:font script="Ethi" typeface="Nyala"/>
-        <a:font script="Beng" typeface="Vrinda"/>
-        <a:font script="Gujr" typeface="Shruti"/>
-        <a:font script="Khmr" typeface="DaunPenh"/>
-        <a:font script="Knda" typeface="Tunga"/>
-        <a:font script="Guru" typeface="Raavi"/>
-        <a:font script="Cans" typeface="Euphemia"/>
-        <a:font script="Cher" typeface="Plantagenet Cherokee"/>
-        <a:font script="Yiii" typeface="Microsoft Yi Baiti"/>
-        <a:font script="Tibt" typeface="Microsoft Himalaya"/>
-        <a:font script="Thaa" typeface="MV Boli"/>
-        <a:font script="Deva" typeface="Mangal"/>
-        <a:font script="Telu" typeface="Gautami"/>
-        <a:font script="Taml" typeface="Latha"/>
-        <a:font script="Syrc" typeface="Estrangelo Edessa"/>
-        <a:font script="Orya" typeface="Kalinga"/>
-        <a:font script="Mlym" typeface="Kartika"/>
-        <a:font script="Laoo" typeface="DokChampa"/>
-        <a:font script="Sinh" typeface="Iskoola Pota"/>
-        <a:font script="Mong" typeface="Mongolian Baiti"/>
-        <a:font script="Viet" typeface="Arial"/>
-        <a:font script="Uigh" typeface="Microsoft Uighur"/>
-        <a:font script="Geor" typeface="Sylfaen"/>
-        <a:font script="Armn" typeface="Arial"/>
-        <a:font script="Bugi" typeface="Leelawadee UI"/>
-        <a:font script="Bopo" typeface="Microsoft JhengHei"/>
-        <a:font script="Java" typeface="Javanese Text"/>
-        <a:font script="Lisu" typeface="Segoe UI"/>
-        <a:font script="Mymr" typeface="Myanmar Text"/>
-        <a:font script="Nkoo" typeface="Ebrima"/>
-        <a:font script="Olck" typeface="Nirmala UI"/>
-        <a:font script="Osma" typeface="Ebrima"/>
-        <a:font script="Phag" typeface="Phagspa"/>
-        <a:font script="Syrn" typeface="Estrangelo Edessa"/>
-        <a:font script="Syrj" typeface="Estrangelo Edessa"/>
-        <a:font script="Syre" typeface="Estrangelo Edessa"/>
-        <a:font script="Sora" typeface="Nirmala UI"/>
-        <a:font script="Tale" typeface="Microsoft Tai Le"/>
-        <a:font script="Talu" typeface="Microsoft New Tai Lue"/>
-        <a:font script="Tfng" typeface="Ebrima"/>
       </a:minorFont>
     </a:fontScheme>
     <a:fmtScheme>
@@ -3705,63 +3264,51 @@
           <a:gsLst>
             <a:gs pos="0">
               <a:schemeClr val="phClr">
-                <a:lumMod val="110000"/>
-                <a:tint val="67000"/>
+                <a:tint val="50000"/>
               </a:schemeClr>
             </a:gs>
-            <a:gs pos="50000">
+            <a:gs pos="35000">
               <a:schemeClr val="phClr">
-                <a:lumMod val="105000"/>
-                <a:tint val="73000"/>
+                <a:tint val="37000"/>
               </a:schemeClr>
             </a:gs>
             <a:gs pos="100000">
               <a:schemeClr val="phClr">
-                <a:lumMod val="105000"/>
-                <a:tint val="81000"/>
+                <a:tint val="15000"/>
               </a:schemeClr>
             </a:gs>
           </a:gsLst>
-          <a:lin ang="5400000" scaled="0"/>
+          <a:lin ang="16200000" scaled="1"/>
           <a:tileRect l="0" t="0" r="0" b="0"/>
         </a:gradFill>
         <a:gradFill>
           <a:gsLst>
             <a:gs pos="0">
               <a:schemeClr val="phClr">
-                <a:lumMod val="102000"/>
-                <a:tint val="94000"/>
-              </a:schemeClr>
-            </a:gs>
-            <a:gs pos="50000">
-              <a:schemeClr val="phClr">
-                <a:lumMod val="100000"/>
+                <a:tint val="100000"/>
                 <a:shade val="100000"/>
               </a:schemeClr>
             </a:gs>
             <a:gs pos="100000">
               <a:schemeClr val="phClr">
-                <a:lumMod val="99000"/>
-                <a:shade val="78000"/>
+                <a:tint val="50000"/>
+                <a:shade val="100000"/>
               </a:schemeClr>
             </a:gs>
           </a:gsLst>
-          <a:lin ang="5400000" scaled="0"/>
+          <a:lin ang="16200000" scaled="0"/>
           <a:tileRect l="0" t="0" r="0" b="0"/>
         </a:gradFill>
       </a:fillStyleLst>
       <a:lnStyleLst>
-        <a:ln w="6350" cap="flat" cmpd="sng" algn="ctr">
+        <a:ln w="9525" cap="flat" cmpd="sng" algn="ctr">
           <a:prstDash val="solid"/>
-          <a:miter lim="800000"/>
         </a:ln>
-        <a:ln w="12700" cap="flat" cmpd="sng" algn="ctr">
+        <a:ln w="25400" cap="flat" cmpd="sng" algn="ctr">
           <a:prstDash val="solid"/>
-          <a:miter lim="800000"/>
         </a:ln>
-        <a:ln w="19050" cap="flat" cmpd="sng" algn="ctr">
+        <a:ln w="38100" cap="flat" cmpd="sng" algn="ctr">
           <a:prstDash val="solid"/>
-          <a:miter lim="800000"/>
         </a:ln>
       </a:lnStyleLst>
       <a:effectStyleLst>
@@ -3779,34 +3326,46 @@
         <a:solidFill>
           <a:schemeClr val="phClr"/>
         </a:solidFill>
-        <a:solidFill>
-          <a:schemeClr val="phClr">
-            <a:tint val="95000"/>
-          </a:schemeClr>
-        </a:solidFill>
         <a:gradFill>
           <a:gsLst>
             <a:gs pos="0">
               <a:schemeClr val="phClr">
-                <a:tint val="93000"/>
-                <a:shade val="98000"/>
-                <a:lumMod val="102000"/>
+                <a:tint val="40000"/>
               </a:schemeClr>
             </a:gs>
-            <a:gs pos="50000">
+            <a:gs pos="40000">
               <a:schemeClr val="phClr">
-                <a:tint val="98000"/>
-                <a:shade val="90000"/>
-                <a:lumMod val="103000"/>
+                <a:tint val="45000"/>
+                <a:shade val="99000"/>
               </a:schemeClr>
             </a:gs>
             <a:gs pos="100000">
               <a:schemeClr val="phClr">
-                <a:shade val="63000"/>
+                <a:shade val="20000"/>
               </a:schemeClr>
             </a:gs>
           </a:gsLst>
-          <a:lin ang="5400000" scaled="0"/>
+          <a:path path="circle">
+            <a:fillToRect l="50000" t="-80000" r="50000" b="180000"/>
+          </a:path>
+          <a:tileRect l="0" t="0" r="0" b="0"/>
+        </a:gradFill>
+        <a:gradFill>
+          <a:gsLst>
+            <a:gs pos="0">
+              <a:schemeClr val="phClr">
+                <a:tint val="80000"/>
+              </a:schemeClr>
+            </a:gs>
+            <a:gs pos="100000">
+              <a:schemeClr val="phClr">
+                <a:shade val="30000"/>
+              </a:schemeClr>
+            </a:gs>
+          </a:gsLst>
+          <a:path path="circle">
+            <a:fillToRect l="50000" t="50000" r="50000" b="50000"/>
+          </a:path>
           <a:tileRect l="0" t="0" r="0" b="0"/>
         </a:gradFill>
       </a:bgFillStyleLst>

</xml_diff>